<commit_message>
Integración del flujo de cuentas no verificadas
- Se agregó el reenvío del correo de confirmación desde el inicio de sesión, protegido con CAPTCHA y una espera persistente de cinco minutos.
- Se implementó una limpieza automática de cuentas no verificadas mediante Supabase Cron.
- pg_cron ejecuta diariamente la tarea durante la madrugada y pg_net invoca la Edge Function encargada de la limpieza.
- La función elimina únicamente cuentas que continúan sin confirmar después de 24 horas.
- La URL del proyecto y el secreto de autorización se almacenan cifrados en Supabase Vault.
</commit_message>
<xml_diff>
--- a/Fase 2/Evidencias Grupales/2.4_GuiaEstudiante_Fase 2_DesarrolloProyecto APT.docx
+++ b/Fase 2/Evidencias Grupales/2.4_GuiaEstudiante_Fase 2_DesarrolloProyecto APT.docx
@@ -88,7 +88,6 @@
                                   <w:szCs w:val="48"/>
                                 </w:rPr>
                               </w:pPr>
-                              <w:proofErr w:type="spellStart"/>
                               <w:r>
                                 <w:rPr>
                                   <w:b/>
@@ -105,17 +104,7 @@
                                   <w:sz w:val="48"/>
                                   <w:szCs w:val="48"/>
                                 </w:rPr>
-                                <w:t>2</w:t>
-                              </w:r>
-                              <w:proofErr w:type="spellEnd"/>
-                              <w:r>
-                                <w:rPr>
-                                  <w:b/>
-                                  <w:color w:val="1F3864" w:themeColor="accent1" w:themeShade="80"/>
-                                  <w:sz w:val="48"/>
-                                  <w:szCs w:val="48"/>
-                                </w:rPr>
-                                <w:t>.</w:t>
+                                <w:t>2.</w:t>
                               </w:r>
                               <w:r>
                                 <w:rPr>
@@ -173,7 +162,6 @@
                                 </w:rPr>
                                 <w:t xml:space="preserve">Asignatura </w:t>
                               </w:r>
-                              <w:proofErr w:type="spellStart"/>
                               <w:r>
                                 <w:rPr>
                                   <w:b/>
@@ -183,7 +171,6 @@
                                 </w:rPr>
                                 <w:t>Capstone</w:t>
                               </w:r>
-                              <w:proofErr w:type="spellEnd"/>
                             </w:p>
                           </w:txbxContent>
                         </wps:txbx>
@@ -277,7 +264,6 @@
                             <w:szCs w:val="48"/>
                           </w:rPr>
                         </w:pPr>
-                        <w:proofErr w:type="spellStart"/>
                         <w:r>
                           <w:rPr>
                             <w:b/>
@@ -294,17 +280,7 @@
                             <w:sz w:val="48"/>
                             <w:szCs w:val="48"/>
                           </w:rPr>
-                          <w:t>2</w:t>
-                        </w:r>
-                        <w:proofErr w:type="spellEnd"/>
-                        <w:r>
-                          <w:rPr>
-                            <w:b/>
-                            <w:color w:val="1F3864" w:themeColor="accent1" w:themeShade="80"/>
-                            <w:sz w:val="48"/>
-                            <w:szCs w:val="48"/>
-                          </w:rPr>
-                          <w:t>.</w:t>
+                          <w:t>2.</w:t>
                         </w:r>
                         <w:r>
                           <w:rPr>
@@ -362,7 +338,6 @@
                           </w:rPr>
                           <w:t xml:space="preserve">Asignatura </w:t>
                         </w:r>
-                        <w:proofErr w:type="spellStart"/>
                         <w:r>
                           <w:rPr>
                             <w:b/>
@@ -372,7 +347,6 @@
                           </w:rPr>
                           <w:t>Capstone</w:t>
                         </w:r>
-                        <w:proofErr w:type="spellEnd"/>
                       </w:p>
                     </w:txbxContent>
                   </v:textbox>
@@ -453,7 +427,7 @@
     </w:p>
     <w:tbl>
       <w:tblPr>
-        <w:tblStyle w:val="Tablaconcuadrcula"/>
+        <w:tblStyle w:val="TableGrid"/>
         <w:tblW w:w="9639" w:type="dxa"/>
         <w:tblInd w:w="-572" w:type="dxa"/>
         <w:tblBorders>
@@ -547,7 +521,7 @@
           </w:tcPr>
           <w:p>
             <w:pPr>
-              <w:pStyle w:val="Piedepgina"/>
+              <w:pStyle w:val="Footer"/>
               <w:jc w:val="both"/>
               <w:rPr>
                 <w:rFonts w:ascii="Calibri" w:hAnsi="Calibri"/>
@@ -591,7 +565,7 @@
     </w:p>
     <w:tbl>
       <w:tblPr>
-        <w:tblStyle w:val="Tablaconcuadrcula"/>
+        <w:tblStyle w:val="TableGrid"/>
         <w:tblW w:w="9639" w:type="dxa"/>
         <w:tblInd w:w="-572" w:type="dxa"/>
         <w:tblBorders>
@@ -1489,7 +1463,7 @@
                 <v:shape id="_x0000_i1025" type="#_x0000_t75" style="width:84pt;height:42pt" o:ole="">
                   <v:imagedata r:id="rId16" o:title=""/>
                 </v:shape>
-                <o:OLEObject Type="Embed" ProgID="Package" ShapeID="_x0000_i1025" DrawAspect="Content" ObjectID="_1853139180" r:id="rId17"/>
+                <o:OLEObject Type="Embed" ProgID="Package" ShapeID="_x0000_i1025" DrawAspect="Content" ObjectID="_1853354706" r:id="rId17"/>
               </w:object>
             </w:r>
             <w:r>
@@ -1545,7 +1519,7 @@
     </w:tbl>
     <w:tbl>
       <w:tblPr>
-        <w:tblStyle w:val="Tablaconcuadrcula"/>
+        <w:tblStyle w:val="TableGrid"/>
         <w:tblpPr w:leftFromText="141" w:rightFromText="141" w:vertAnchor="text" w:horzAnchor="margin" w:tblpX="-719" w:tblpY="-116"/>
         <w:tblW w:w="9640" w:type="dxa"/>
         <w:tblBorders>
@@ -1667,7 +1641,7 @@
     </w:p>
     <w:tbl>
       <w:tblPr>
-        <w:tblStyle w:val="Tablaconcuadrcula"/>
+        <w:tblStyle w:val="TableGrid"/>
         <w:tblpPr w:leftFromText="180" w:rightFromText="180" w:vertAnchor="page" w:horzAnchor="margin" w:tblpXSpec="center" w:tblpY="3517"/>
         <w:tblW w:w="9776" w:type="dxa"/>
         <w:tblBorders>
@@ -1861,7 +1835,7 @@
             </w:r>
             <w:r>
               <w:rPr>
-                <w:rStyle w:val="Refdenotaalpie"/>
+                <w:rStyle w:val="FootnoteReference"/>
                 <w:rFonts w:ascii="Calibri" w:hAnsi="Calibri"/>
                 <w:color w:val="1F3864" w:themeColor="accent1" w:themeShade="80"/>
                 <w:sz w:val="18"/>
@@ -2057,7 +2031,7 @@
                 </w:tcPr>
                 <w:p>
                   <w:pPr>
-                    <w:pStyle w:val="Piedepgina"/>
+                    <w:pStyle w:val="Footer"/>
                     <w:framePr w:hSpace="180" w:wrap="around" w:vAnchor="page" w:hAnchor="margin" w:xAlign="center" w:y="3517"/>
                     <w:jc w:val="both"/>
                     <w:rPr>
@@ -2087,7 +2061,23 @@
                 <w:rFonts w:ascii="Calibri" w:hAnsi="Calibri"/>
                 <w:color w:val="1F3864" w:themeColor="accent1" w:themeShade="80"/>
               </w:rPr>
-              <w:t xml:space="preserve"> Nombre de  Actividades/Tareas</w:t>
+              <w:t xml:space="preserve"> Nombre </w:t>
+            </w:r>
+            <w:proofErr w:type="gramStart"/>
+            <w:r>
+              <w:rPr>
+                <w:rFonts w:ascii="Calibri" w:hAnsi="Calibri"/>
+                <w:color w:val="1F3864" w:themeColor="accent1" w:themeShade="80"/>
+              </w:rPr>
+              <w:t>de  Actividades</w:t>
+            </w:r>
+            <w:proofErr w:type="gramEnd"/>
+            <w:r>
+              <w:rPr>
+                <w:rFonts w:ascii="Calibri" w:hAnsi="Calibri"/>
+                <w:color w:val="1F3864" w:themeColor="accent1" w:themeShade="80"/>
+              </w:rPr>
+              <w:t>/Tareas</w:t>
             </w:r>
           </w:p>
         </w:tc>
@@ -2545,7 +2535,6 @@
           </w:tcPr>
           <w:p>
             <w:pPr>
-              <w:pStyle w:val="Tablaconcuadrcula"/>
               <w:jc w:val="both"/>
               <w:rPr>
                 <w:rFonts w:ascii="Calibri" w:hAnsi="Calibri"/>
@@ -2770,7 +2759,6 @@
           </w:tcPr>
           <w:p>
             <w:pPr>
-              <w:pStyle w:val="Tablaconcuadrcula"/>
               <w:jc w:val="both"/>
               <w:rPr>
                 <w:sz w:val="18"/>
@@ -3009,7 +2997,6 @@
           </w:tcPr>
           <w:p>
             <w:pPr>
-              <w:pStyle w:val="Tablaconcuadrcula"/>
               <w:jc w:val="both"/>
               <w:rPr>
                 <w:rFonts w:ascii="Calibri" w:hAnsi="Calibri" w:cs="Arial"/>
@@ -3351,7 +3338,6 @@
           </w:tcPr>
           <w:p>
             <w:pPr>
-              <w:pStyle w:val="Tablaconcuadrcula"/>
               <w:jc w:val="both"/>
               <w:rPr>
                 <w:rFonts w:ascii="Calibri" w:hAnsi="Calibri" w:cs="Arial"/>
@@ -3593,7 +3579,6 @@
           </w:tcPr>
           <w:p>
             <w:pPr>
-              <w:pStyle w:val="Tablaconcuadrcula"/>
               <w:jc w:val="both"/>
               <w:rPr>
                 <w:rFonts w:ascii="Calibri" w:hAnsi="Calibri" w:cs="Arial"/>
@@ -3826,7 +3811,6 @@
           </w:tcPr>
           <w:p>
             <w:pPr>
-              <w:pStyle w:val="Tablaconcuadrcula"/>
               <w:jc w:val="both"/>
               <w:rPr>
                 <w:rFonts w:ascii="Calibri" w:hAnsi="Calibri" w:cs="Arial"/>
@@ -3879,7 +3863,7 @@
                 <w:color w:val="548DD4"/>
                 <w:sz w:val="18"/>
                 <w:szCs w:val="20"/>
-                <w:lang w:eastAsia="es-CL"/>
+                <w:lang w:val="en-US" w:eastAsia="es-CL"/>
               </w:rPr>
             </w:pPr>
             <w:r>
@@ -4079,7 +4063,6 @@
           </w:tcPr>
           <w:p>
             <w:pPr>
-              <w:pStyle w:val="Tablaconcuadrcula"/>
               <w:jc w:val="both"/>
               <w:rPr>
                 <w:rFonts w:ascii="Calibri" w:hAnsi="Calibri" w:cs="Arial"/>
@@ -4425,7 +4408,6 @@
           </w:tcPr>
           <w:p>
             <w:pPr>
-              <w:pStyle w:val="Tablaconcuadrcula"/>
               <w:jc w:val="both"/>
               <w:rPr>
                 <w:rFonts w:ascii="Calibri" w:hAnsi="Calibri" w:cs="Arial"/>
@@ -4649,7 +4631,6 @@
           </w:tcPr>
           <w:p>
             <w:pPr>
-              <w:pStyle w:val="Tablaconcuadrcula"/>
               <w:jc w:val="both"/>
               <w:rPr>
                 <w:rFonts w:ascii="Calibri" w:hAnsi="Calibri" w:cs="Arial"/>
@@ -4884,7 +4865,6 @@
           </w:tcPr>
           <w:p>
             <w:pPr>
-              <w:pStyle w:val="Tablaconcuadrcula"/>
               <w:jc w:val="both"/>
               <w:rPr>
                 <w:rFonts w:ascii="Calibri" w:hAnsi="Calibri" w:cs="Arial"/>
@@ -5126,7 +5106,6 @@
           </w:tcPr>
           <w:p>
             <w:pPr>
-              <w:pStyle w:val="Tablaconcuadrcula"/>
               <w:jc w:val="both"/>
               <w:rPr>
                 <w:rFonts w:ascii="Calibri" w:hAnsi="Calibri" w:cs="Arial"/>
@@ -5361,7 +5340,6 @@
           </w:tcPr>
           <w:p>
             <w:pPr>
-              <w:pStyle w:val="Tablaconcuadrcula"/>
               <w:jc w:val="both"/>
               <w:rPr>
                 <w:rFonts w:ascii="Calibri" w:hAnsi="Calibri" w:cs="Arial"/>
@@ -5606,7 +5584,6 @@
           </w:tcPr>
           <w:p>
             <w:pPr>
-              <w:pStyle w:val="Tablaconcuadrcula"/>
               <w:jc w:val="both"/>
               <w:rPr>
                 <w:rFonts w:ascii="Calibri" w:hAnsi="Calibri" w:cs="Arial"/>
@@ -5700,6 +5677,7 @@
                 <w:lang w:eastAsia="es-CL"/>
               </w:rPr>
             </w:pPr>
+            <w:proofErr w:type="gramStart"/>
             <w:r>
               <w:rPr>
                 <w:rFonts w:ascii="Calibri" w:hAnsi="Calibri" w:cs="Arial"/>
@@ -5727,6 +5705,7 @@
               </w:rPr>
               <w:t>s</w:t>
             </w:r>
+            <w:proofErr w:type="gramEnd"/>
           </w:p>
         </w:tc>
         <w:tc>
@@ -5879,7 +5858,6 @@
           </w:tcPr>
           <w:p>
             <w:pPr>
-              <w:pStyle w:val="Tablaconcuadrcula"/>
               <w:jc w:val="both"/>
               <w:rPr>
                 <w:rFonts w:ascii="Calibri" w:hAnsi="Calibri" w:cs="Arial"/>
@@ -6132,7 +6110,6 @@
           </w:tcPr>
           <w:p>
             <w:pPr>
-              <w:pStyle w:val="Tablaconcuadrcula"/>
               <w:jc w:val="both"/>
               <w:rPr>
                 <w:rFonts w:ascii="Calibri" w:hAnsi="Calibri" w:cs="Arial"/>
@@ -6367,7 +6344,6 @@
           </w:tcPr>
           <w:p>
             <w:pPr>
-              <w:pStyle w:val="Tablaconcuadrcula"/>
               <w:jc w:val="both"/>
               <w:rPr>
                 <w:rFonts w:ascii="Calibri" w:hAnsi="Calibri" w:cs="Arial"/>
@@ -6712,7 +6688,6 @@
           </w:tcPr>
           <w:p>
             <w:pPr>
-              <w:pStyle w:val="Tablaconcuadrcula"/>
               <w:jc w:val="both"/>
               <w:rPr>
                 <w:rFonts w:ascii="Calibri" w:hAnsi="Calibri" w:cs="Arial"/>
@@ -7058,7 +7033,6 @@
           </w:tcPr>
           <w:p>
             <w:pPr>
-              <w:pStyle w:val="Tablaconcuadrcula"/>
               <w:jc w:val="both"/>
               <w:rPr>
                 <w:rFonts w:ascii="Calibri" w:hAnsi="Calibri" w:cs="Arial"/>
@@ -7385,7 +7359,6 @@
           </w:tcPr>
           <w:p>
             <w:pPr>
-              <w:pStyle w:val="Tablaconcuadrcula"/>
               <w:jc w:val="both"/>
               <w:rPr>
                 <w:rFonts w:ascii="Calibri" w:hAnsi="Calibri" w:cs="Arial"/>
@@ -7712,7 +7685,6 @@
           </w:tcPr>
           <w:p>
             <w:pPr>
-              <w:pStyle w:val="Tablaconcuadrcula"/>
               <w:jc w:val="both"/>
               <w:rPr>
                 <w:rFonts w:ascii="Calibri" w:hAnsi="Calibri" w:cs="Arial"/>
@@ -8057,7 +8029,6 @@
           </w:tcPr>
           <w:p>
             <w:pPr>
-              <w:pStyle w:val="Tablaconcuadrcula"/>
               <w:jc w:val="both"/>
               <w:rPr>
                 <w:rFonts w:ascii="Calibri" w:hAnsi="Calibri" w:cs="Arial"/>
@@ -8402,7 +8373,6 @@
           </w:tcPr>
           <w:p>
             <w:pPr>
-              <w:pStyle w:val="Tablaconcuadrcula"/>
               <w:jc w:val="both"/>
               <w:rPr>
                 <w:rFonts w:ascii="Calibri" w:hAnsi="Calibri" w:cs="Arial"/>
@@ -8748,7 +8718,6 @@
           </w:tcPr>
           <w:p>
             <w:pPr>
-              <w:pStyle w:val="Tablaconcuadrcula"/>
               <w:jc w:val="both"/>
               <w:rPr>
                 <w:rFonts w:ascii="Calibri" w:hAnsi="Calibri" w:cs="Arial"/>
@@ -9093,7 +9062,6 @@
           </w:tcPr>
           <w:p>
             <w:pPr>
-              <w:pStyle w:val="Tablaconcuadrcula"/>
               <w:jc w:val="both"/>
               <w:rPr>
                 <w:rFonts w:ascii="Calibri" w:hAnsi="Calibri" w:cs="Arial"/>
@@ -9326,7 +9294,6 @@
           </w:tcPr>
           <w:p>
             <w:pPr>
-              <w:pStyle w:val="Tablaconcuadrcula"/>
               <w:jc w:val="both"/>
               <w:rPr>
                 <w:rFonts w:ascii="Calibri" w:hAnsi="Calibri" w:cs="Arial"/>
@@ -9599,7 +9566,6 @@
           </w:tcPr>
           <w:p>
             <w:pPr>
-              <w:pStyle w:val="Tablaconcuadrcula"/>
               <w:jc w:val="both"/>
               <w:rPr>
                 <w:rFonts w:ascii="Calibri" w:hAnsi="Calibri" w:cs="Arial"/>
@@ -9834,7 +9800,6 @@
           </w:tcPr>
           <w:p>
             <w:pPr>
-              <w:pStyle w:val="Tablaconcuadrcula"/>
               <w:jc w:val="both"/>
               <w:rPr>
                 <w:rFonts w:ascii="Calibri" w:hAnsi="Calibri" w:cs="Arial"/>
@@ -10079,7 +10044,6 @@
           </w:tcPr>
           <w:p>
             <w:pPr>
-              <w:pStyle w:val="Tablaconcuadrcula"/>
               <w:jc w:val="both"/>
               <w:rPr>
                 <w:rFonts w:ascii="Calibri" w:hAnsi="Calibri" w:cs="Arial"/>
@@ -10314,7 +10278,6 @@
           </w:tcPr>
           <w:p>
             <w:pPr>
-              <w:pStyle w:val="Tablaconcuadrcula"/>
               <w:jc w:val="both"/>
               <w:rPr>
                 <w:rFonts w:ascii="Calibri" w:hAnsi="Calibri" w:cs="Arial"/>
@@ -10549,7 +10512,6 @@
           </w:tcPr>
           <w:p>
             <w:pPr>
-              <w:pStyle w:val="Tablaconcuadrcula"/>
               <w:jc w:val="both"/>
               <w:rPr>
                 <w:rFonts w:ascii="Calibri" w:hAnsi="Calibri" w:cs="Arial"/>
@@ -10784,7 +10746,6 @@
           </w:tcPr>
           <w:p>
             <w:pPr>
-              <w:pStyle w:val="Tablaconcuadrcula"/>
               <w:jc w:val="both"/>
               <w:rPr>
                 <w:rFonts w:ascii="Calibri" w:hAnsi="Calibri" w:cs="Arial"/>
@@ -11037,7 +10998,6 @@
           </w:tcPr>
           <w:p>
             <w:pPr>
-              <w:pStyle w:val="Tablaconcuadrcula"/>
               <w:jc w:val="both"/>
               <w:rPr>
                 <w:rFonts w:ascii="Calibri" w:hAnsi="Calibri" w:cs="Arial"/>
@@ -11365,7 +11325,6 @@
           </w:tcPr>
           <w:p>
             <w:pPr>
-              <w:pStyle w:val="Tablaconcuadrcula"/>
               <w:jc w:val="both"/>
               <w:rPr>
                 <w:rFonts w:ascii="Calibri" w:hAnsi="Calibri" w:cs="Arial"/>
@@ -11589,7 +11548,6 @@
           </w:tcPr>
           <w:p>
             <w:pPr>
-              <w:pStyle w:val="Tablaconcuadrcula"/>
               <w:jc w:val="both"/>
               <w:rPr>
                 <w:rFonts w:ascii="Calibri" w:hAnsi="Calibri" w:cs="Arial"/>
@@ -11952,7 +11910,6 @@
           </w:tcPr>
           <w:p>
             <w:pPr>
-              <w:pStyle w:val="Tablaconcuadrcula"/>
               <w:jc w:val="both"/>
               <w:rPr>
                 <w:rFonts w:ascii="Calibri" w:hAnsi="Calibri" w:cs="Arial"/>
@@ -12176,7 +12133,6 @@
           </w:tcPr>
           <w:p>
             <w:pPr>
-              <w:pStyle w:val="Tablaconcuadrcula"/>
               <w:jc w:val="both"/>
               <w:rPr>
                 <w:rFonts w:ascii="Calibri" w:hAnsi="Calibri" w:cs="Arial"/>
@@ -12420,7 +12376,6 @@
           </w:tcPr>
           <w:p>
             <w:pPr>
-              <w:pStyle w:val="Tablaconcuadrcula"/>
               <w:jc w:val="both"/>
               <w:rPr>
                 <w:rFonts w:ascii="Calibri" w:hAnsi="Calibri" w:cs="Arial"/>
@@ -12656,7 +12611,6 @@
           </w:tcPr>
           <w:p>
             <w:pPr>
-              <w:pStyle w:val="Tablaconcuadrcula"/>
               <w:jc w:val="both"/>
               <w:rPr>
                 <w:rFonts w:ascii="Calibri" w:hAnsi="Calibri" w:cs="Arial"/>
@@ -12909,7 +12863,6 @@
           </w:tcPr>
           <w:p>
             <w:pPr>
-              <w:pStyle w:val="Tablaconcuadrcula"/>
               <w:jc w:val="both"/>
               <w:rPr>
                 <w:rFonts w:ascii="Calibri" w:hAnsi="Calibri" w:cs="Arial"/>
@@ -13144,7 +13097,6 @@
           </w:tcPr>
           <w:p>
             <w:pPr>
-              <w:pStyle w:val="Tablaconcuadrcula"/>
               <w:jc w:val="both"/>
               <w:rPr>
                 <w:rFonts w:ascii="Calibri" w:hAnsi="Calibri" w:cs="Arial"/>
@@ -13379,7 +13331,6 @@
           </w:tcPr>
           <w:p>
             <w:pPr>
-              <w:pStyle w:val="Tablaconcuadrcula"/>
               <w:jc w:val="both"/>
               <w:rPr>
                 <w:rFonts w:ascii="Calibri" w:hAnsi="Calibri" w:cs="Arial"/>
@@ -13623,7 +13574,6 @@
           </w:tcPr>
           <w:p>
             <w:pPr>
-              <w:pStyle w:val="Tablaconcuadrcula"/>
               <w:jc w:val="both"/>
               <w:rPr>
                 <w:rFonts w:ascii="Calibri" w:hAnsi="Calibri" w:cs="Arial"/>
@@ -13859,7 +13809,6 @@
           </w:tcPr>
           <w:p>
             <w:pPr>
-              <w:pStyle w:val="Tablaconcuadrcula"/>
               <w:jc w:val="both"/>
               <w:rPr>
                 <w:rFonts w:ascii="Calibri" w:hAnsi="Calibri" w:cs="Arial"/>
@@ -14138,7 +14087,6 @@
           </w:tcPr>
           <w:p>
             <w:pPr>
-              <w:pStyle w:val="Tablaconcuadrcula"/>
               <w:jc w:val="both"/>
               <w:rPr>
                 <w:rFonts w:ascii="Calibri" w:hAnsi="Calibri" w:cs="Arial"/>
@@ -14362,7 +14310,6 @@
           </w:tcPr>
           <w:p>
             <w:pPr>
-              <w:pStyle w:val="Tablaconcuadrcula"/>
               <w:jc w:val="both"/>
               <w:rPr>
                 <w:rFonts w:ascii="Calibri" w:hAnsi="Calibri" w:cs="Arial"/>
@@ -14586,7 +14533,6 @@
           </w:tcPr>
           <w:p>
             <w:pPr>
-              <w:pStyle w:val="Tablaconcuadrcula"/>
               <w:jc w:val="both"/>
               <w:rPr>
                 <w:rFonts w:ascii="Calibri" w:hAnsi="Calibri" w:cs="Arial"/>
@@ -14921,7 +14867,6 @@
           </w:tcPr>
           <w:p>
             <w:pPr>
-              <w:pStyle w:val="Tablaconcuadrcula"/>
               <w:jc w:val="both"/>
               <w:rPr>
                 <w:rFonts w:ascii="Calibri" w:hAnsi="Calibri" w:cs="Arial"/>
@@ -15163,7 +15108,6 @@
           </w:tcPr>
           <w:p>
             <w:pPr>
-              <w:pStyle w:val="Tablaconcuadrcula"/>
               <w:jc w:val="both"/>
               <w:rPr>
                 <w:rFonts w:ascii="Calibri" w:hAnsi="Calibri" w:cs="Arial"/>
@@ -15408,7 +15352,17 @@
                 <w:szCs w:val="20"/>
                 <w:lang w:eastAsia="es-CL"/>
               </w:rPr>
-              <w:t xml:space="preserve">Requerimientos de </w:t>
+              <w:t xml:space="preserve">Requerimientos </w:t>
+            </w:r>
+            <w:proofErr w:type="gramStart"/>
+            <w:r>
+              <w:rPr>
+                <w:rFonts w:ascii="Calibri" w:hAnsi="Calibri" w:cs="Arial"/>
+                <w:sz w:val="18"/>
+                <w:szCs w:val="20"/>
+                <w:lang w:eastAsia="es-CL"/>
+              </w:rPr>
+              <w:t xml:space="preserve">de </w:t>
             </w:r>
             <w:r>
               <w:rPr>
@@ -15419,36 +15373,17 @@
                 <w:szCs w:val="20"/>
                 <w:lang w:eastAsia="es-CL"/>
               </w:rPr>
-              <w:t xml:space="preserve"> </w:t>
-            </w:r>
-            <w:r>
-              <w:rPr>
-                <w:rFonts w:ascii="Calibri" w:hAnsi="Calibri" w:cs="Arial"/>
-                <w:iCs/>
-                <w:color w:val="000000" w:themeColor="text1"/>
-                <w:sz w:val="18"/>
-                <w:szCs w:val="20"/>
-                <w:lang w:eastAsia="es-CL"/>
-              </w:rPr>
-              <w:t>Completado</w:t>
-            </w:r>
-            <w:r>
-              <w:rPr>
-                <w:rFonts w:ascii="Calibri" w:hAnsi="Calibri" w:cs="Arial"/>
-                <w:sz w:val="18"/>
-                <w:szCs w:val="20"/>
-                <w:lang w:eastAsia="es-CL"/>
-              </w:rPr>
-              <w:t xml:space="preserve"> </w:t>
-            </w:r>
-            <w:r>
-              <w:rPr>
-                <w:rFonts w:ascii="Calibri" w:hAnsi="Calibri" w:cs="Arial"/>
-                <w:sz w:val="18"/>
-                <w:szCs w:val="20"/>
-                <w:lang w:eastAsia="es-CL"/>
-              </w:rPr>
-              <w:t>información y bases de datos</w:t>
+              <w:t xml:space="preserve"> Completado</w:t>
+            </w:r>
+            <w:proofErr w:type="gramEnd"/>
+            <w:r>
+              <w:rPr>
+                <w:rFonts w:ascii="Calibri" w:hAnsi="Calibri" w:cs="Arial"/>
+                <w:sz w:val="18"/>
+                <w:szCs w:val="20"/>
+                <w:lang w:eastAsia="es-CL"/>
+              </w:rPr>
+              <w:t xml:space="preserve"> información y bases de datos</w:t>
             </w:r>
           </w:p>
         </w:tc>
@@ -15458,7 +15393,6 @@
           </w:tcPr>
           <w:p>
             <w:pPr>
-              <w:pStyle w:val="Tablaconcuadrcula"/>
               <w:jc w:val="both"/>
               <w:rPr>
                 <w:rFonts w:ascii="Calibri" w:hAnsi="Calibri" w:cs="Arial"/>
@@ -15785,7 +15719,6 @@
           </w:tcPr>
           <w:p>
             <w:pPr>
-              <w:pStyle w:val="Tablaconcuadrcula"/>
               <w:jc w:val="both"/>
               <w:rPr>
                 <w:rFonts w:ascii="Calibri" w:hAnsi="Calibri" w:cs="Arial"/>
@@ -16029,7 +15962,6 @@
           </w:tcPr>
           <w:p>
             <w:pPr>
-              <w:pStyle w:val="Tablaconcuadrcula"/>
               <w:jc w:val="both"/>
               <w:rPr>
                 <w:rFonts w:ascii="Calibri" w:hAnsi="Calibri" w:cs="Arial"/>
@@ -16265,7 +16197,6 @@
           </w:tcPr>
           <w:p>
             <w:pPr>
-              <w:pStyle w:val="Tablaconcuadrcula"/>
               <w:jc w:val="both"/>
               <w:rPr>
                 <w:rFonts w:ascii="Calibri" w:hAnsi="Calibri" w:cs="Arial"/>
@@ -16509,7 +16440,6 @@
           </w:tcPr>
           <w:p>
             <w:pPr>
-              <w:pStyle w:val="Tablaconcuadrcula"/>
               <w:jc w:val="both"/>
               <w:rPr>
                 <w:rFonts w:ascii="Calibri" w:hAnsi="Calibri" w:cs="Arial"/>
@@ -16744,7 +16674,6 @@
           </w:tcPr>
           <w:p>
             <w:pPr>
-              <w:pStyle w:val="Tablaconcuadrcula"/>
               <w:jc w:val="both"/>
               <w:rPr>
                 <w:rFonts w:ascii="Calibri" w:hAnsi="Calibri" w:cs="Arial"/>
@@ -16997,7 +16926,6 @@
           </w:tcPr>
           <w:p>
             <w:pPr>
-              <w:pStyle w:val="Tablaconcuadrcula"/>
               <w:jc w:val="both"/>
               <w:rPr>
                 <w:rFonts w:ascii="Calibri" w:hAnsi="Calibri" w:cs="Arial"/>
@@ -17232,7 +17160,6 @@
           </w:tcPr>
           <w:p>
             <w:pPr>
-              <w:pStyle w:val="Tablaconcuadrcula"/>
               <w:jc w:val="both"/>
               <w:rPr>
                 <w:rFonts w:ascii="Calibri" w:hAnsi="Calibri" w:cs="Arial"/>
@@ -17468,7 +17395,6 @@
           </w:tcPr>
           <w:p>
             <w:pPr>
-              <w:pStyle w:val="Tablaconcuadrcula"/>
               <w:jc w:val="both"/>
               <w:rPr>
                 <w:rFonts w:ascii="Calibri" w:hAnsi="Calibri" w:cs="Arial"/>
@@ -17630,29 +17556,7 @@
                 <w:szCs w:val="20"/>
                 <w:lang w:eastAsia="es-CL"/>
               </w:rPr>
-              <w:t>Inc</w:t>
-            </w:r>
-            <w:r>
-              <w:rPr>
-                <w:rFonts w:ascii="Calibri" w:hAnsi="Calibri" w:cs="Arial"/>
-                <w:iCs/>
-                <w:color w:val="000000" w:themeColor="text1"/>
-                <w:sz w:val="18"/>
-                <w:szCs w:val="20"/>
-                <w:lang w:eastAsia="es-CL"/>
-              </w:rPr>
-              <w:t>omple</w:t>
-            </w:r>
-            <w:r>
-              <w:rPr>
-                <w:rFonts w:ascii="Calibri" w:hAnsi="Calibri" w:cs="Arial"/>
-                <w:iCs/>
-                <w:color w:val="000000" w:themeColor="text1"/>
-                <w:sz w:val="18"/>
-                <w:szCs w:val="20"/>
-                <w:lang w:eastAsia="es-CL"/>
-              </w:rPr>
-              <w:t>to</w:t>
+              <w:t>Incompleto</w:t>
             </w:r>
           </w:p>
         </w:tc>
@@ -17712,7 +17616,6 @@
           </w:tcPr>
           <w:p>
             <w:pPr>
-              <w:pStyle w:val="Tablaconcuadrcula"/>
               <w:jc w:val="both"/>
               <w:rPr>
                 <w:rFonts w:ascii="Calibri" w:hAnsi="Calibri" w:cs="Arial"/>
@@ -17936,7 +17839,6 @@
           </w:tcPr>
           <w:p>
             <w:pPr>
-              <w:pStyle w:val="Tablaconcuadrcula"/>
               <w:jc w:val="both"/>
               <w:rPr>
                 <w:rFonts w:ascii="Calibri" w:hAnsi="Calibri" w:cs="Arial"/>
@@ -18160,7 +18062,6 @@
           </w:tcPr>
           <w:p>
             <w:pPr>
-              <w:pStyle w:val="Tablaconcuadrcula"/>
               <w:jc w:val="both"/>
               <w:rPr>
                 <w:rFonts w:ascii="Calibri" w:hAnsi="Calibri" w:cs="Arial"/>
@@ -18497,7 +18398,6 @@
           </w:tcPr>
           <w:p>
             <w:pPr>
-              <w:pStyle w:val="Tablaconcuadrcula"/>
               <w:jc w:val="both"/>
               <w:rPr>
                 <w:rFonts w:ascii="Calibri" w:hAnsi="Calibri" w:cs="Arial"/>
@@ -18722,7 +18622,6 @@
           </w:tcPr>
           <w:p>
             <w:pPr>
-              <w:pStyle w:val="Tablaconcuadrcula"/>
               <w:jc w:val="both"/>
               <w:rPr>
                 <w:rFonts w:ascii="Calibri" w:hAnsi="Calibri" w:cs="Arial"/>
@@ -18946,7 +18845,6 @@
           </w:tcPr>
           <w:p>
             <w:pPr>
-              <w:pStyle w:val="Tablaconcuadrcula"/>
               <w:jc w:val="both"/>
               <w:rPr>
                 <w:rFonts w:ascii="Calibri" w:hAnsi="Calibri" w:cs="Arial"/>
@@ -19159,7 +19057,6 @@
           </w:tcPr>
           <w:p>
             <w:pPr>
-              <w:pStyle w:val="Tablaconcuadrcula"/>
               <w:jc w:val="both"/>
               <w:rPr>
                 <w:rFonts w:ascii="Calibri" w:hAnsi="Calibri" w:cs="Arial"/>
@@ -19401,7 +19298,6 @@
           </w:tcPr>
           <w:p>
             <w:pPr>
-              <w:pStyle w:val="Tablaconcuadrcula"/>
               <w:jc w:val="both"/>
               <w:rPr>
                 <w:rFonts w:ascii="Calibri" w:hAnsi="Calibri" w:cs="Arial"/>
@@ -19645,7 +19541,6 @@
           </w:tcPr>
           <w:p>
             <w:pPr>
-              <w:pStyle w:val="Tablaconcuadrcula"/>
               <w:jc w:val="both"/>
               <w:rPr>
                 <w:rFonts w:ascii="Calibri" w:hAnsi="Calibri" w:cs="Arial"/>
@@ -19877,7 +19772,6 @@
           </w:tcPr>
           <w:p>
             <w:pPr>
-              <w:pStyle w:val="Tablaconcuadrcula"/>
               <w:jc w:val="both"/>
               <w:rPr>
                 <w:rFonts w:ascii="Calibri" w:hAnsi="Calibri" w:cs="Arial"/>
@@ -20119,7 +20013,6 @@
           </w:tcPr>
           <w:p>
             <w:pPr>
-              <w:pStyle w:val="Tablaconcuadrcula"/>
               <w:jc w:val="both"/>
               <w:rPr>
                 <w:rFonts w:ascii="Calibri" w:hAnsi="Calibri" w:cs="Arial"/>
@@ -20343,7 +20236,6 @@
           </w:tcPr>
           <w:p>
             <w:pPr>
-              <w:pStyle w:val="Tablaconcuadrcula"/>
               <w:jc w:val="both"/>
               <w:rPr>
                 <w:rFonts w:ascii="Calibri" w:hAnsi="Calibri" w:cs="Arial"/>
@@ -20585,7 +20477,6 @@
           </w:tcPr>
           <w:p>
             <w:pPr>
-              <w:pStyle w:val="Tablaconcuadrcula"/>
               <w:jc w:val="both"/>
               <w:rPr>
                 <w:rFonts w:ascii="Calibri" w:hAnsi="Calibri" w:cs="Arial"/>
@@ -20816,7 +20707,6 @@
           </w:tcPr>
           <w:p>
             <w:pPr>
-              <w:pStyle w:val="Tablaconcuadrcula"/>
               <w:jc w:val="both"/>
               <w:rPr>
                 <w:rFonts w:ascii="Calibri" w:hAnsi="Calibri" w:cs="Arial"/>
@@ -21057,7 +20947,6 @@
           </w:tcPr>
           <w:p>
             <w:pPr>
-              <w:pStyle w:val="Tablaconcuadrcula"/>
               <w:jc w:val="both"/>
               <w:rPr>
                 <w:rFonts w:ascii="Calibri" w:hAnsi="Calibri" w:cs="Arial"/>
@@ -21339,7 +21228,7 @@
     </w:p>
     <w:tbl>
       <w:tblPr>
-        <w:tblStyle w:val="Tablaconcuadrcula"/>
+        <w:tblStyle w:val="TableGrid"/>
         <w:tblW w:w="9498" w:type="dxa"/>
         <w:tblInd w:w="-572" w:type="dxa"/>
         <w:tblBorders>
@@ -21415,7 +21304,7 @@
           </w:tcPr>
           <w:p>
             <w:pPr>
-              <w:pStyle w:val="Piedepgina"/>
+              <w:pStyle w:val="Footer"/>
               <w:jc w:val="both"/>
               <w:rPr>
                 <w:rFonts w:ascii="Calibri" w:hAnsi="Calibri"/>
@@ -21495,7 +21384,7 @@
     </w:p>
     <w:tbl>
       <w:tblPr>
-        <w:tblStyle w:val="Tablaconcuadrcula"/>
+        <w:tblStyle w:val="TableGrid"/>
         <w:tblpPr w:leftFromText="180" w:rightFromText="180" w:vertAnchor="text" w:horzAnchor="margin" w:tblpX="-572" w:tblpY="1"/>
         <w:tblW w:w="5590" w:type="pct"/>
         <w:tblBorders>
@@ -21593,7 +21482,17 @@
                 <w:szCs w:val="20"/>
                 <w:lang w:eastAsia="es-CL"/>
               </w:rPr>
-              <w:t xml:space="preserve">Durante el desarrollo del Proyecto APT, uno de los principales factores que ha facilitado el avance ha sido la organización del trabajo y la distribución de las tareas dentro del equipo. Además, contar con herramientas de desarrollo como Visual Studio Code, GitHub, </w:t>
+              <w:t xml:space="preserve"> </w:t>
+            </w:r>
+            <w:r>
+              <w:rPr>
+                <w:rFonts w:ascii="Calibri" w:hAnsi="Calibri" w:cs="Arial"/>
+                <w:color w:val="548DD4"/>
+                <w:sz w:val="20"/>
+                <w:szCs w:val="20"/>
+                <w:lang w:eastAsia="es-CL"/>
+              </w:rPr>
+              <w:t xml:space="preserve">Durante el desarrollo del Proyecto </w:t>
             </w:r>
             <w:proofErr w:type="spellStart"/>
             <w:r>
@@ -21604,7 +21503,7 @@
                 <w:szCs w:val="20"/>
                 <w:lang w:eastAsia="es-CL"/>
               </w:rPr>
-              <w:t>React</w:t>
+              <w:t>Ferreplast</w:t>
             </w:r>
             <w:proofErr w:type="spellEnd"/>
             <w:r>
@@ -21615,7 +21514,7 @@
                 <w:szCs w:val="20"/>
                 <w:lang w:eastAsia="es-CL"/>
               </w:rPr>
-              <w:t xml:space="preserve">, Vite y </w:t>
+              <w:t xml:space="preserve">, uno de los principales factores que ha facilitado el avance ha sido la constante comunicación del quipo y una óptima distribución de las tareas realizadas y por completar. Además, el uso de herramientas como </w:t>
             </w:r>
             <w:proofErr w:type="spellStart"/>
             <w:r>
@@ -21626,6 +21525,48 @@
                 <w:szCs w:val="20"/>
                 <w:lang w:eastAsia="es-CL"/>
               </w:rPr>
+              <w:t>keep</w:t>
+            </w:r>
+            <w:proofErr w:type="spellEnd"/>
+            <w:r>
+              <w:rPr>
+                <w:rFonts w:ascii="Calibri" w:hAnsi="Calibri" w:cs="Arial"/>
+                <w:color w:val="548DD4"/>
+                <w:sz w:val="20"/>
+                <w:szCs w:val="20"/>
+                <w:lang w:eastAsia="es-CL"/>
+              </w:rPr>
+              <w:t xml:space="preserve"> para ir anotando de manera grupal los detalles encontrados, Codex para facilitar y apresurar de manera </w:t>
+            </w:r>
+            <w:r>
+              <w:rPr>
+                <w:rFonts w:ascii="Calibri" w:hAnsi="Calibri" w:cs="Arial"/>
+                <w:color w:val="548DD4"/>
+                <w:sz w:val="20"/>
+                <w:szCs w:val="20"/>
+                <w:lang w:eastAsia="es-CL"/>
+              </w:rPr>
+              <w:t>óptima</w:t>
+            </w:r>
+            <w:r>
+              <w:rPr>
+                <w:rFonts w:ascii="Calibri" w:hAnsi="Calibri" w:cs="Arial"/>
+                <w:color w:val="548DD4"/>
+                <w:sz w:val="20"/>
+                <w:szCs w:val="20"/>
+                <w:lang w:eastAsia="es-CL"/>
+              </w:rPr>
+              <w:t xml:space="preserve"> código del proyecto y </w:t>
+            </w:r>
+            <w:proofErr w:type="spellStart"/>
+            <w:r>
+              <w:rPr>
+                <w:rFonts w:ascii="Calibri" w:hAnsi="Calibri" w:cs="Arial"/>
+                <w:color w:val="548DD4"/>
+                <w:sz w:val="20"/>
+                <w:szCs w:val="20"/>
+                <w:lang w:eastAsia="es-CL"/>
+              </w:rPr>
               <w:t>Supabase</w:t>
             </w:r>
             <w:proofErr w:type="spellEnd"/>
@@ -21637,10 +21578,12 @@
                 <w:szCs w:val="20"/>
                 <w:lang w:eastAsia="es-CL"/>
               </w:rPr>
-              <w:t xml:space="preserve"> ha permitido avanzar en la construcción e integración de las distintas funcionalidades del sistema </w:t>
-            </w:r>
-            <w:proofErr w:type="spellStart"/>
-            <w:r>
+              <w:t xml:space="preserve"> que almacena un gran variedad de herramientas que pueden ser integradas fácilmente al proyecto, entre ellas confirmación de correos, CAPTCHA y base de datos en la nube, nos ha permitido avanzar en la construcción e integración de distintas funcionalidades en cortos periodos de tiempo procurando mantener un orden y desarrollo fiable al momento de implementar y ejecutar.</w:t>
+            </w:r>
+          </w:p>
+          <w:p>
+            <w:pPr>
+              <w:jc w:val="both"/>
               <w:rPr>
                 <w:rFonts w:ascii="Calibri" w:hAnsi="Calibri" w:cs="Arial"/>
                 <w:color w:val="548DD4"/>
@@ -21648,9 +21591,7 @@
                 <w:szCs w:val="20"/>
                 <w:lang w:eastAsia="es-CL"/>
               </w:rPr>
-              <w:t>Ferreplast</w:t>
-            </w:r>
-            <w:proofErr w:type="spellEnd"/>
+            </w:pPr>
             <w:r>
               <w:rPr>
                 <w:rFonts w:ascii="Calibri" w:hAnsi="Calibri" w:cs="Arial"/>
@@ -21659,6 +21600,188 @@
                 <w:szCs w:val="20"/>
                 <w:lang w:eastAsia="es-CL"/>
               </w:rPr>
+              <w:t>Otro factor favorable fueron los conocimientos adquiridos durante la carrera y el uso crítico de herramientas de inteligencia artificial durante el desarrollo. Codex se utilizó como apoyo para explorar alternativas técnicas, revisar fragmentos de código, detectar posibles errores y agilizar la elaboración de propuestas. Sin embargo, cada solución sugerida fue analizada, adaptada a los requerimientos del proyecto y sometida a pruebas por el equipo, que mantuvo la responsabilidad sobre las decisiones técnicas y el resultado final.</w:t>
+            </w:r>
+          </w:p>
+          <w:p>
+            <w:pPr>
+              <w:jc w:val="both"/>
+              <w:rPr>
+                <w:rFonts w:ascii="Calibri" w:hAnsi="Calibri" w:cs="Arial"/>
+                <w:color w:val="548DD4"/>
+                <w:sz w:val="20"/>
+                <w:szCs w:val="20"/>
+                <w:lang w:eastAsia="es-CL"/>
+              </w:rPr>
+            </w:pPr>
+            <w:r>
+              <w:rPr>
+                <w:rFonts w:ascii="Calibri" w:hAnsi="Calibri" w:cs="Arial"/>
+                <w:color w:val="548DD4"/>
+                <w:sz w:val="20"/>
+                <w:szCs w:val="20"/>
+                <w:lang w:eastAsia="es-CL"/>
+              </w:rPr>
+              <w:t xml:space="preserve">Por otra parte, se han presentado algunas dificultades durante el desarrollo, principalmente relacionadas con la integración de </w:t>
+            </w:r>
+            <w:r>
+              <w:rPr>
+                <w:rFonts w:ascii="Calibri" w:hAnsi="Calibri" w:cs="Arial"/>
+                <w:color w:val="548DD4"/>
+                <w:sz w:val="20"/>
+                <w:szCs w:val="20"/>
+                <w:lang w:eastAsia="es-CL"/>
+              </w:rPr>
+              <w:t>funcionalidades</w:t>
+            </w:r>
+            <w:r>
+              <w:rPr>
+                <w:rFonts w:ascii="Calibri" w:hAnsi="Calibri" w:cs="Arial"/>
+                <w:color w:val="548DD4"/>
+                <w:sz w:val="20"/>
+                <w:szCs w:val="20"/>
+                <w:lang w:eastAsia="es-CL"/>
+              </w:rPr>
+              <w:t xml:space="preserve"> (como algunas integraciones de medios de pago</w:t>
+            </w:r>
+            <w:r>
+              <w:rPr>
+                <w:rFonts w:ascii="Calibri" w:hAnsi="Calibri" w:cs="Arial"/>
+                <w:color w:val="548DD4"/>
+                <w:sz w:val="20"/>
+                <w:szCs w:val="20"/>
+                <w:lang w:eastAsia="es-CL"/>
+              </w:rPr>
+              <w:t xml:space="preserve"> o poder notificar bajo stock según proveedor debido a que no requerimos con esa información</w:t>
+            </w:r>
+            <w:r>
+              <w:rPr>
+                <w:rFonts w:ascii="Calibri" w:hAnsi="Calibri" w:cs="Arial"/>
+                <w:color w:val="548DD4"/>
+                <w:sz w:val="20"/>
+                <w:szCs w:val="20"/>
+                <w:lang w:eastAsia="es-CL"/>
+              </w:rPr>
+              <w:t>)</w:t>
+            </w:r>
+            <w:r>
+              <w:rPr>
+                <w:rFonts w:ascii="Calibri" w:hAnsi="Calibri" w:cs="Arial"/>
+                <w:color w:val="548DD4"/>
+                <w:sz w:val="20"/>
+                <w:szCs w:val="20"/>
+                <w:lang w:eastAsia="es-CL"/>
+              </w:rPr>
+              <w:t xml:space="preserve"> y</w:t>
+            </w:r>
+            <w:r>
+              <w:rPr>
+                <w:rFonts w:ascii="Calibri" w:hAnsi="Calibri" w:cs="Arial"/>
+                <w:color w:val="548DD4"/>
+                <w:sz w:val="20"/>
+                <w:szCs w:val="20"/>
+                <w:lang w:eastAsia="es-CL"/>
+              </w:rPr>
+              <w:t xml:space="preserve"> </w:t>
+            </w:r>
+            <w:r>
+              <w:rPr>
+                <w:rFonts w:ascii="Calibri" w:hAnsi="Calibri" w:cs="Arial"/>
+                <w:color w:val="548DD4"/>
+                <w:sz w:val="20"/>
+                <w:szCs w:val="20"/>
+                <w:lang w:eastAsia="es-CL"/>
+              </w:rPr>
+              <w:t>algunos</w:t>
+            </w:r>
+            <w:r>
+              <w:rPr>
+                <w:rFonts w:ascii="Calibri" w:hAnsi="Calibri" w:cs="Arial"/>
+                <w:color w:val="548DD4"/>
+                <w:sz w:val="20"/>
+                <w:szCs w:val="20"/>
+                <w:lang w:eastAsia="es-CL"/>
+              </w:rPr>
+              <w:t xml:space="preserve"> pequeños</w:t>
+            </w:r>
+            <w:r>
+              <w:rPr>
+                <w:rFonts w:ascii="Calibri" w:hAnsi="Calibri" w:cs="Arial"/>
+                <w:color w:val="548DD4"/>
+                <w:sz w:val="20"/>
+                <w:szCs w:val="20"/>
+                <w:lang w:eastAsia="es-CL"/>
+              </w:rPr>
+              <w:t xml:space="preserve"> </w:t>
+            </w:r>
+            <w:r>
+              <w:rPr>
+                <w:rFonts w:ascii="Calibri" w:hAnsi="Calibri" w:cs="Arial"/>
+                <w:color w:val="548DD4"/>
+                <w:sz w:val="20"/>
+                <w:szCs w:val="20"/>
+                <w:lang w:eastAsia="es-CL"/>
+              </w:rPr>
+              <w:t>errores de programación</w:t>
+            </w:r>
+            <w:r>
+              <w:rPr>
+                <w:rFonts w:ascii="Calibri" w:hAnsi="Calibri" w:cs="Arial"/>
+                <w:color w:val="548DD4"/>
+                <w:sz w:val="20"/>
+                <w:szCs w:val="20"/>
+                <w:lang w:eastAsia="es-CL"/>
+              </w:rPr>
+              <w:t xml:space="preserve"> (había un</w:t>
+            </w:r>
+            <w:r>
+              <w:rPr>
+                <w:rFonts w:ascii="Calibri" w:hAnsi="Calibri" w:cs="Arial"/>
+                <w:color w:val="548DD4"/>
+                <w:sz w:val="20"/>
+                <w:szCs w:val="20"/>
+                <w:lang w:eastAsia="es-CL"/>
+              </w:rPr>
+              <w:t xml:space="preserve"> detalle</w:t>
+            </w:r>
+            <w:r>
+              <w:rPr>
+                <w:rFonts w:ascii="Calibri" w:hAnsi="Calibri" w:cs="Arial"/>
+                <w:color w:val="548DD4"/>
+                <w:sz w:val="20"/>
+                <w:szCs w:val="20"/>
+                <w:lang w:eastAsia="es-CL"/>
+              </w:rPr>
+              <w:t xml:space="preserve"> que mostraba los cambios de los productos, pero no un producto nuevo para </w:t>
+            </w:r>
+            <w:r>
+              <w:rPr>
+                <w:rFonts w:ascii="Calibri" w:hAnsi="Calibri" w:cs="Arial"/>
+                <w:color w:val="548DD4"/>
+                <w:sz w:val="20"/>
+                <w:szCs w:val="20"/>
+                <w:lang w:eastAsia="es-CL"/>
+              </w:rPr>
+              <w:t>la posterior aprobación por parte de administración</w:t>
+            </w:r>
+            <w:r>
+              <w:rPr>
+                <w:rFonts w:ascii="Calibri" w:hAnsi="Calibri" w:cs="Arial"/>
+                <w:color w:val="548DD4"/>
+                <w:sz w:val="20"/>
+                <w:szCs w:val="20"/>
+                <w:lang w:eastAsia="es-CL"/>
+              </w:rPr>
+              <w:t>)</w:t>
+            </w:r>
+            <w:r>
+              <w:rPr>
+                <w:rFonts w:ascii="Calibri" w:hAnsi="Calibri" w:cs="Arial"/>
+                <w:color w:val="548DD4"/>
+                <w:sz w:val="20"/>
+                <w:szCs w:val="20"/>
+                <w:lang w:eastAsia="es-CL"/>
+              </w:rPr>
               <w:t>.</w:t>
             </w:r>
           </w:p>
@@ -21681,12 +21804,9 @@
                 <w:szCs w:val="20"/>
                 <w:lang w:eastAsia="es-CL"/>
               </w:rPr>
-              <w:t>Otro factor favorable ha sido el conocimiento adquirido durante la carrera, especialmente en programación, bases de datos, desarrollo web y manejo de herramientas de control de versiones. Estos conocimientos han permitido resolver problemas técnicos y adaptar el proyecto a los requerimientos establecidos.</w:t>
-            </w:r>
-          </w:p>
-          <w:p>
-            <w:pPr>
-              <w:jc w:val="both"/>
+              <w:t xml:space="preserve">Para solucionar estas dificultades, se han realizado revisiones periódicas del código, pruebas de las funcionalidades </w:t>
+            </w:r>
+            <w:r>
               <w:rPr>
                 <w:rFonts w:ascii="Calibri" w:hAnsi="Calibri" w:cs="Arial"/>
                 <w:color w:val="548DD4"/>
@@ -21694,7 +21814,8 @@
                 <w:szCs w:val="20"/>
                 <w:lang w:eastAsia="es-CL"/>
               </w:rPr>
-            </w:pPr>
+              <w:t>implementadas</w:t>
+            </w:r>
             <w:r>
               <w:rPr>
                 <w:rFonts w:ascii="Calibri" w:hAnsi="Calibri" w:cs="Arial"/>
@@ -21703,14 +21824,15 @@
                 <w:szCs w:val="20"/>
                 <w:lang w:eastAsia="es-CL"/>
               </w:rPr>
-              <w:t xml:space="preserve">Por otra parte, se han presentado algunas dificultades durante el desarrollo, principalmente relacionadas con la integración de funcionalidades, errores de programación y la coordinación de las distintas partes del sistema. </w:t>
-            </w:r>
-          </w:p>
-          <w:p>
-            <w:pPr>
-              <w:jc w:val="both"/>
-              <w:rPr>
-                <w:rFonts w:ascii="Calibri" w:hAnsi="Calibri" w:cs="Arial"/>
+              <w:t xml:space="preserve"> y búsqueda de soluciones técnicas cuando ha sido necesario. Además, se ha priorizado el desarrollo de las funcionalidades pendientes y su posterior integración y prueba, con el objetivo de cumplir con los objetivos establecidos en el plan de trabajo.</w:t>
+            </w:r>
+          </w:p>
+          <w:p>
+            <w:pPr>
+              <w:jc w:val="both"/>
+              <w:rPr>
+                <w:rFonts w:ascii="Calibri" w:hAnsi="Calibri" w:cs="Arial"/>
+                <w:i/>
                 <w:color w:val="548DD4"/>
                 <w:sz w:val="20"/>
                 <w:szCs w:val="20"/>
@@ -21725,117 +21847,8 @@
                 <w:szCs w:val="20"/>
                 <w:lang w:eastAsia="es-CL"/>
               </w:rPr>
-              <w:t xml:space="preserve">Para solucionar estas dificultades, se han realizado revisiones periódicas del código, pruebas de las funcionalidades </w:t>
-            </w:r>
-            <w:r>
-              <w:rPr>
-                <w:rFonts w:ascii="Calibri" w:hAnsi="Calibri" w:cs="Arial"/>
-                <w:color w:val="548DD4"/>
-                <w:sz w:val="20"/>
-                <w:szCs w:val="20"/>
-                <w:lang w:eastAsia="es-CL"/>
-              </w:rPr>
-              <w:t>implementadas</w:t>
-            </w:r>
-            <w:r>
-              <w:rPr>
-                <w:rFonts w:ascii="Calibri" w:hAnsi="Calibri" w:cs="Arial"/>
-                <w:color w:val="548DD4"/>
-                <w:sz w:val="20"/>
-                <w:szCs w:val="20"/>
-                <w:lang w:eastAsia="es-CL"/>
-              </w:rPr>
-              <w:t xml:space="preserve"> y búsqueda de soluciones técnicas cuando ha sido necesario. Además, se ha priorizado el desarrollo de las funcionalidades pendientes y su posterior integración y prueba, con el objetivo de cumplir con los objetivos establecidos en el plan de trabajo.</w:t>
-            </w:r>
-          </w:p>
-          <w:p>
-            <w:pPr>
-              <w:jc w:val="both"/>
-              <w:rPr>
-                <w:rFonts w:ascii="Calibri" w:hAnsi="Calibri" w:cs="Arial"/>
-                <w:color w:val="548DD4"/>
-                <w:sz w:val="20"/>
-                <w:szCs w:val="20"/>
-                <w:lang w:eastAsia="es-CL"/>
-              </w:rPr>
-            </w:pPr>
-            <w:r>
-              <w:rPr>
-                <w:rFonts w:ascii="Calibri" w:hAnsi="Calibri" w:cs="Arial"/>
-                <w:color w:val="548DD4"/>
-                <w:sz w:val="20"/>
-                <w:szCs w:val="20"/>
-                <w:lang w:eastAsia="es-CL"/>
-              </w:rPr>
               <w:t>A pesar de las dificultades, estas situaciones han permitido identificar aspectos que requieren mejoras y adquirir mayor experiencia en el desarrollo de un proyecto informático, favoreciendo el avance progresivo del Proyecto APT.</w:t>
             </w:r>
-          </w:p>
-          <w:p>
-            <w:pPr>
-              <w:jc w:val="both"/>
-              <w:rPr>
-                <w:rFonts w:ascii="Calibri" w:hAnsi="Calibri" w:cs="Arial"/>
-                <w:color w:val="000000" w:themeColor="text1"/>
-                <w:sz w:val="20"/>
-                <w:szCs w:val="20"/>
-                <w:lang w:eastAsia="es-CL"/>
-              </w:rPr>
-            </w:pPr>
-          </w:p>
-          <w:p>
-            <w:pPr>
-              <w:rPr>
-                <w:rFonts w:ascii="Calibri" w:hAnsi="Calibri"/>
-                <w:color w:val="1F3864" w:themeColor="accent1" w:themeShade="80"/>
-              </w:rPr>
-            </w:pPr>
-          </w:p>
-          <w:p>
-            <w:pPr>
-              <w:rPr>
-                <w:rFonts w:ascii="Calibri" w:hAnsi="Calibri"/>
-                <w:color w:val="1F3864" w:themeColor="accent1" w:themeShade="80"/>
-              </w:rPr>
-            </w:pPr>
-          </w:p>
-          <w:p>
-            <w:pPr>
-              <w:jc w:val="both"/>
-              <w:rPr>
-                <w:rFonts w:ascii="Calibri" w:hAnsi="Calibri" w:cs="Arial"/>
-                <w:i/>
-                <w:color w:val="548DD4"/>
-                <w:sz w:val="20"/>
-                <w:szCs w:val="20"/>
-                <w:lang w:eastAsia="es-CL"/>
-              </w:rPr>
-            </w:pPr>
-          </w:p>
-          <w:p>
-            <w:pPr>
-              <w:jc w:val="both"/>
-              <w:rPr>
-                <w:rFonts w:ascii="Calibri" w:hAnsi="Calibri" w:cs="Arial"/>
-                <w:i/>
-                <w:color w:val="548DD4"/>
-                <w:sz w:val="20"/>
-                <w:szCs w:val="20"/>
-                <w:lang w:eastAsia="es-CL"/>
-              </w:rPr>
-            </w:pPr>
-          </w:p>
-          <w:p>
-            <w:pPr>
-              <w:jc w:val="both"/>
-              <w:rPr>
-                <w:rFonts w:ascii="Calibri" w:hAnsi="Calibri" w:cs="Arial"/>
-                <w:i/>
-                <w:color w:val="548DD4"/>
-                <w:sz w:val="20"/>
-                <w:szCs w:val="20"/>
-                <w:lang w:eastAsia="es-CL"/>
-              </w:rPr>
-            </w:pPr>
           </w:p>
         </w:tc>
       </w:tr>
@@ -21853,7 +21866,7 @@
     </w:p>
     <w:tbl>
       <w:tblPr>
-        <w:tblStyle w:val="Tablaconcuadrcula"/>
+        <w:tblStyle w:val="TableGrid"/>
         <w:tblpPr w:leftFromText="180" w:rightFromText="180" w:vertAnchor="text" w:horzAnchor="margin" w:tblpX="-572" w:tblpY="107"/>
         <w:tblW w:w="5588" w:type="pct"/>
         <w:tblBorders>
@@ -21883,7 +21896,7 @@
               <w:jc w:val="both"/>
               <w:rPr>
                 <w:rFonts w:ascii="Calibri" w:hAnsi="Calibri" w:cs="Arial"/>
-                <w:i/>
+                <w:iCs/>
                 <w:color w:val="548DD4"/>
                 <w:sz w:val="20"/>
                 <w:szCs w:val="20"/>
@@ -21916,7 +21929,7 @@
                 <w:szCs w:val="20"/>
                 <w:lang w:eastAsia="es-CL"/>
               </w:rPr>
-              <w:t xml:space="preserve">Durante el desarrollo del Proyecto APT de </w:t>
+              <w:t xml:space="preserve">Durante el desarrollo del Proyecto </w:t>
             </w:r>
             <w:proofErr w:type="spellStart"/>
             <w:r>
@@ -21940,7 +21953,7 @@
                 <w:szCs w:val="20"/>
                 <w:lang w:eastAsia="es-CL"/>
               </w:rPr>
-              <w:t>, ha sido necesario realizar ajustes en la planificación de algunas actividades para adaptarse al avance real del proyecto y a las dificultades técnicas que se han presentado.</w:t>
+              <w:t>, ha sido necesario realizar ajustes en la planificación de algunas actividades para adaptarse al avance real del proyecto</w:t>
             </w:r>
             <w:r>
               <w:rPr>
@@ -21951,39 +21964,122 @@
                 <w:szCs w:val="20"/>
                 <w:lang w:eastAsia="es-CL"/>
               </w:rPr>
-              <w:t xml:space="preserve">  Un ejemplo de ello es el cambio en el flujo de pago, ya que en el sprint 3 el cliente pidió que se agregara dos banco más a la página.</w:t>
-            </w:r>
-          </w:p>
-          <w:p>
-            <w:pPr>
-              <w:jc w:val="both"/>
-              <w:rPr>
-                <w:rFonts w:ascii="Calibri" w:hAnsi="Calibri" w:cs="Arial"/>
-                <w:i/>
+              <w:t xml:space="preserve"> según el cronograma y en otros casos añadir o eliminar algunas funcionalidades establecidas desde un comienzo y otras sugeridas durante el desarrollo.</w:t>
+            </w:r>
+            <w:r>
+              <w:rPr>
+                <w:rFonts w:ascii="Calibri" w:hAnsi="Calibri" w:cs="Arial"/>
+                <w:iCs/>
                 <w:color w:val="548DD4"/>
                 <w:sz w:val="20"/>
                 <w:szCs w:val="20"/>
                 <w:lang w:eastAsia="es-CL"/>
               </w:rPr>
-            </w:pPr>
-            <w:r>
-              <w:rPr>
-                <w:rFonts w:ascii="Calibri" w:hAnsi="Calibri" w:cs="Arial"/>
-                <w:i/>
+              <w:t xml:space="preserve"> </w:t>
+            </w:r>
+            <w:r>
+              <w:rPr>
+                <w:rFonts w:ascii="Calibri" w:hAnsi="Calibri" w:cs="Arial"/>
+                <w:iCs/>
                 <w:color w:val="548DD4"/>
                 <w:sz w:val="20"/>
                 <w:szCs w:val="20"/>
                 <w:lang w:eastAsia="es-CL"/>
               </w:rPr>
+              <w:t>Algunos ejemplos son:</w:t>
+            </w:r>
+          </w:p>
+          <w:p>
+            <w:pPr>
+              <w:pStyle w:val="ListParagraph"/>
+              <w:numPr>
+                <w:ilvl w:val="0"/>
+                <w:numId w:val="2"/>
+              </w:numPr>
+              <w:jc w:val="both"/>
+              <w:rPr>
+                <w:rFonts w:ascii="Calibri" w:hAnsi="Calibri" w:cs="Arial"/>
+                <w:iCs/>
+                <w:color w:val="548DD4"/>
+                <w:sz w:val="20"/>
+                <w:szCs w:val="20"/>
+                <w:lang w:eastAsia="es-CL"/>
+              </w:rPr>
+            </w:pPr>
+            <w:r>
+              <w:rPr>
+                <w:rFonts w:ascii="Calibri" w:hAnsi="Calibri" w:cs="Arial"/>
+                <w:iCs/>
+                <w:color w:val="548DD4"/>
+                <w:sz w:val="20"/>
+                <w:szCs w:val="20"/>
+                <w:lang w:eastAsia="es-CL"/>
+              </w:rPr>
+              <w:t>E</w:t>
+            </w:r>
+            <w:r>
+              <w:rPr>
+                <w:rFonts w:ascii="Calibri" w:hAnsi="Calibri" w:cs="Arial"/>
+                <w:iCs/>
+                <w:color w:val="548DD4"/>
+                <w:sz w:val="20"/>
+                <w:szCs w:val="20"/>
+                <w:lang w:eastAsia="es-CL"/>
+              </w:rPr>
+              <w:t xml:space="preserve">l cambio en el flujo de pago, ya que en el sprint 3 el cliente pidió que se agregara dos </w:t>
+            </w:r>
+            <w:r>
+              <w:rPr>
+                <w:rFonts w:ascii="Calibri" w:hAnsi="Calibri" w:cs="Arial"/>
+                <w:iCs/>
+                <w:color w:val="548DD4"/>
+                <w:sz w:val="20"/>
+                <w:szCs w:val="20"/>
+                <w:lang w:eastAsia="es-CL"/>
+              </w:rPr>
+              <w:t>medios de pago</w:t>
+            </w:r>
+            <w:r>
+              <w:rPr>
+                <w:rFonts w:ascii="Calibri" w:hAnsi="Calibri" w:cs="Arial"/>
+                <w:iCs/>
+                <w:color w:val="548DD4"/>
+                <w:sz w:val="20"/>
+                <w:szCs w:val="20"/>
+                <w:lang w:eastAsia="es-CL"/>
+              </w:rPr>
+              <w:t xml:space="preserve"> más a la página</w:t>
+            </w:r>
+            <w:r>
+              <w:rPr>
+                <w:rFonts w:ascii="Calibri" w:hAnsi="Calibri" w:cs="Arial"/>
+                <w:iCs/>
+                <w:color w:val="548DD4"/>
+                <w:sz w:val="20"/>
+                <w:szCs w:val="20"/>
+                <w:lang w:eastAsia="es-CL"/>
+              </w:rPr>
+              <w:t xml:space="preserve"> (Banco de Chile y Banco BCI)</w:t>
+            </w:r>
+            <w:r>
+              <w:rPr>
+                <w:rFonts w:ascii="Calibri" w:hAnsi="Calibri" w:cs="Arial"/>
+                <w:iCs/>
+                <w:color w:val="548DD4"/>
+                <w:sz w:val="20"/>
+                <w:szCs w:val="20"/>
+                <w:lang w:eastAsia="es-CL"/>
+              </w:rPr>
               <w:t>.</w:t>
             </w:r>
           </w:p>
           <w:p>
             <w:pPr>
-              <w:jc w:val="both"/>
-              <w:rPr>
-                <w:rFonts w:ascii="Calibri" w:hAnsi="Calibri" w:cs="Arial"/>
-                <w:i/>
+              <w:pStyle w:val="ListParagraph"/>
+              <w:jc w:val="both"/>
+              <w:rPr>
+                <w:rFonts w:ascii="Calibri" w:hAnsi="Calibri" w:cs="Arial"/>
+                <w:iCs/>
                 <w:color w:val="548DD4"/>
                 <w:sz w:val="20"/>
                 <w:szCs w:val="20"/>
@@ -21993,32 +22089,36 @@
           </w:p>
           <w:p>
             <w:pPr>
-              <w:jc w:val="both"/>
-              <w:rPr>
-                <w:rFonts w:ascii="Calibri" w:hAnsi="Calibri" w:cs="Arial"/>
-                <w:i/>
-                <w:color w:val="C00000"/>
+              <w:pStyle w:val="ListParagraph"/>
+              <w:numPr>
+                <w:ilvl w:val="0"/>
+                <w:numId w:val="2"/>
+              </w:numPr>
+              <w:jc w:val="both"/>
+              <w:rPr>
+                <w:rFonts w:ascii="Calibri" w:hAnsi="Calibri" w:cs="Arial"/>
+                <w:i/>
+                <w:color w:val="548DD4"/>
                 <w:sz w:val="20"/>
                 <w:szCs w:val="20"/>
                 <w:lang w:eastAsia="es-CL"/>
               </w:rPr>
             </w:pPr>
-          </w:p>
-          <w:p>
-            <w:pPr>
-              <w:jc w:val="both"/>
-              <w:rPr>
-                <w:rFonts w:ascii="Calibri" w:hAnsi="Calibri" w:cs="Arial"/>
-                <w:i/>
+            <w:r>
+              <w:rPr>
+                <w:rFonts w:ascii="Calibri" w:hAnsi="Calibri" w:cs="Arial"/>
+                <w:iCs/>
                 <w:color w:val="548DD4"/>
                 <w:sz w:val="20"/>
                 <w:szCs w:val="20"/>
                 <w:lang w:eastAsia="es-CL"/>
               </w:rPr>
-            </w:pPr>
-          </w:p>
-          <w:p>
-            <w:pPr>
+              <w:t>Se evaluó incorporar autenticación de dos factores (2FA) como una medida adicional al CAPTCHA. Inicialmente se propuso aplicarla a todos los usuarios y, posteriormente, restringirla únicamente a los roles internos con mayores privilegios, como administración y bodega. Sin embargo, el cliente descartó ambas alternativas debido a que la empresa está compuesta por tres trabajadores y busca mantener un acceso sencillo, sin depender de aplicaciones externas ni de códigos adicionales. También se consideró que parte de su clientela actual posee una familiaridad limitada con la tecnología. Aunque inicialmente existieron dudas respecto del CAPTCHA, se acordó conservarlo después de explicar su importancia para reducir accesos automatizados y posibles abusos. Como medidas complementarias se mantuvieron la confirmación de correo, las restricciones de reenvío, la validación de roles y la eliminación automática de cuentas no verificadas. No obstante, se reconoce como riesgo residual que estas medidas no sustituyen la protección que ofrecería un segundo factor, por lo que su incorporación para cuentas administrativas puede reconsiderarse en el futuro.</w:t>
+            </w:r>
+          </w:p>
+          <w:p>
+            <w:pPr>
+              <w:pStyle w:val="ListParagraph"/>
               <w:jc w:val="both"/>
               <w:rPr>
                 <w:rFonts w:ascii="Calibri" w:hAnsi="Calibri" w:cs="Arial"/>
@@ -22032,6 +22132,11 @@
           </w:p>
           <w:p>
             <w:pPr>
+              <w:pStyle w:val="ListParagraph"/>
+              <w:numPr>
+                <w:ilvl w:val="0"/>
+                <w:numId w:val="2"/>
+              </w:numPr>
               <w:jc w:val="both"/>
               <w:rPr>
                 <w:rFonts w:ascii="Calibri" w:hAnsi="Calibri" w:cs="Arial"/>
@@ -22042,32 +22147,61 @@
                 <w:lang w:eastAsia="es-CL"/>
               </w:rPr>
             </w:pPr>
-          </w:p>
-          <w:p>
-            <w:pPr>
-              <w:jc w:val="both"/>
-              <w:rPr>
-                <w:rFonts w:ascii="Calibri" w:hAnsi="Calibri" w:cs="Arial"/>
-                <w:i/>
+            <w:r>
+              <w:rPr>
+                <w:rFonts w:ascii="Calibri" w:hAnsi="Calibri" w:cs="Arial"/>
+                <w:iCs/>
                 <w:color w:val="548DD4"/>
                 <w:sz w:val="20"/>
                 <w:szCs w:val="20"/>
                 <w:lang w:eastAsia="es-CL"/>
               </w:rPr>
-            </w:pPr>
-          </w:p>
-          <w:p>
-            <w:pPr>
-              <w:jc w:val="both"/>
-              <w:rPr>
-                <w:rFonts w:ascii="Calibri" w:hAnsi="Calibri" w:cs="Arial"/>
-                <w:i/>
+              <w:t xml:space="preserve">Notificar el stock mínimo según la demora de la entrega de productos según el proveedor y la demanda </w:t>
+            </w:r>
+            <w:r>
+              <w:rPr>
+                <w:rFonts w:ascii="Calibri" w:hAnsi="Calibri" w:cs="Arial"/>
+                <w:iCs/>
                 <w:color w:val="548DD4"/>
                 <w:sz w:val="20"/>
                 <w:szCs w:val="20"/>
                 <w:lang w:eastAsia="es-CL"/>
               </w:rPr>
-            </w:pPr>
+              <w:t>de este</w:t>
+            </w:r>
+            <w:r>
+              <w:rPr>
+                <w:rFonts w:ascii="Calibri" w:hAnsi="Calibri" w:cs="Arial"/>
+                <w:iCs/>
+                <w:color w:val="548DD4"/>
+                <w:sz w:val="20"/>
+                <w:szCs w:val="20"/>
+                <w:lang w:eastAsia="es-CL"/>
+              </w:rPr>
+              <w:t>, debido a que el cliente no facilitó y tampoco tiene la intención de brindar dicha información, por lo que se sugiere indicar el stock mínimo según la importancia del producto y ventas mensuales</w:t>
+            </w:r>
+            <w:r>
+              <w:rPr>
+                <w:rFonts w:ascii="Calibri" w:hAnsi="Calibri" w:cs="Arial"/>
+                <w:iCs/>
+                <w:color w:val="548DD4"/>
+                <w:sz w:val="20"/>
+                <w:szCs w:val="20"/>
+                <w:lang w:eastAsia="es-CL"/>
+              </w:rPr>
+              <w:t xml:space="preserve"> (complementado con la alerta de stock mínimo común de 10 unidades).</w:t>
+            </w:r>
+            <w:r>
+              <w:rPr>
+                <w:rFonts w:ascii="Calibri" w:hAnsi="Calibri" w:cs="Arial"/>
+                <w:i/>
+                <w:color w:val="548DD4"/>
+                <w:sz w:val="20"/>
+                <w:szCs w:val="20"/>
+                <w:lang w:eastAsia="es-CL"/>
+              </w:rPr>
+              <w:t xml:space="preserve"> </w:t>
+            </w:r>
           </w:p>
         </w:tc>
       </w:tr>
@@ -22102,7 +22236,7 @@
     </w:p>
     <w:tbl>
       <w:tblPr>
-        <w:tblStyle w:val="Tablaconcuadrcula"/>
+        <w:tblStyle w:val="TableGrid"/>
         <w:tblW w:w="5591" w:type="pct"/>
         <w:tblInd w:w="-572" w:type="dxa"/>
         <w:tblBorders>
@@ -22132,7 +22266,7 @@
               <w:jc w:val="both"/>
               <w:rPr>
                 <w:rFonts w:ascii="Calibri" w:hAnsi="Calibri" w:cs="Arial"/>
-                <w:iCs/>
+                <w:i/>
                 <w:color w:val="548DD4"/>
                 <w:sz w:val="20"/>
                 <w:szCs w:val="20"/>
@@ -22160,127 +22294,14 @@
             <w:r>
               <w:rPr>
                 <w:rFonts w:ascii="Calibri" w:hAnsi="Calibri" w:cs="Arial"/>
-                <w:i/>
+                <w:iCs/>
                 <w:color w:val="548DD4"/>
                 <w:sz w:val="20"/>
                 <w:szCs w:val="20"/>
                 <w:lang w:eastAsia="es-CL"/>
               </w:rPr>
-              <w:t>Las actividades que no se han iniciado son en lo general son las pruebas de seguridad.</w:t>
-            </w:r>
-            <w:r>
-              <w:rPr>
-                <w:rFonts w:ascii="Calibri" w:hAnsi="Calibri" w:cs="Arial"/>
-                <w:i/>
-                <w:color w:val="548DD4"/>
-                <w:sz w:val="20"/>
-                <w:szCs w:val="20"/>
-                <w:lang w:eastAsia="es-CL"/>
-              </w:rPr>
-              <w:t xml:space="preserve"> </w:t>
-            </w:r>
-            <w:r>
-              <w:rPr>
-                <w:rFonts w:ascii="Calibri" w:hAnsi="Calibri" w:cs="Arial"/>
-                <w:iCs/>
-                <w:color w:val="548DD4"/>
-                <w:sz w:val="20"/>
-                <w:szCs w:val="20"/>
-                <w:lang w:eastAsia="es-CL"/>
-              </w:rPr>
-              <w:t>No no hemos atrasado con la demás actividades.</w:t>
-            </w:r>
-          </w:p>
-          <w:p>
-            <w:pPr>
-              <w:jc w:val="both"/>
-              <w:rPr>
-                <w:rFonts w:ascii="Calibri" w:hAnsi="Calibri" w:cs="Arial"/>
-                <w:i/>
-                <w:color w:val="548DD4"/>
-                <w:sz w:val="20"/>
-                <w:szCs w:val="20"/>
-                <w:lang w:eastAsia="es-CL"/>
-              </w:rPr>
-            </w:pPr>
-          </w:p>
-          <w:p>
-            <w:pPr>
-              <w:jc w:val="both"/>
-              <w:rPr>
-                <w:rFonts w:ascii="Calibri" w:hAnsi="Calibri" w:cs="Arial"/>
-                <w:i/>
-                <w:color w:val="548DD4"/>
-                <w:sz w:val="20"/>
-                <w:szCs w:val="20"/>
-                <w:lang w:eastAsia="es-CL"/>
-              </w:rPr>
-            </w:pPr>
-          </w:p>
-          <w:p>
-            <w:pPr>
-              <w:jc w:val="both"/>
-              <w:rPr>
-                <w:rFonts w:ascii="Calibri" w:hAnsi="Calibri" w:cs="Arial"/>
-                <w:i/>
-                <w:color w:val="548DD4"/>
-                <w:sz w:val="20"/>
-                <w:szCs w:val="20"/>
-                <w:lang w:eastAsia="es-CL"/>
-              </w:rPr>
-            </w:pPr>
-          </w:p>
-          <w:p>
-            <w:pPr>
-              <w:jc w:val="both"/>
-              <w:rPr>
-                <w:rFonts w:ascii="Calibri" w:hAnsi="Calibri" w:cs="Arial"/>
-                <w:i/>
-                <w:color w:val="548DD4"/>
-                <w:sz w:val="20"/>
-                <w:szCs w:val="20"/>
-                <w:lang w:eastAsia="es-CL"/>
-              </w:rPr>
-            </w:pPr>
-          </w:p>
-          <w:p>
-            <w:pPr>
-              <w:jc w:val="both"/>
-              <w:rPr>
-                <w:rFonts w:ascii="Calibri" w:hAnsi="Calibri" w:cs="Arial"/>
-                <w:i/>
-                <w:color w:val="548DD4"/>
-                <w:sz w:val="20"/>
-                <w:szCs w:val="20"/>
-                <w:lang w:eastAsia="es-CL"/>
-              </w:rPr>
-            </w:pPr>
-          </w:p>
-          <w:p>
-            <w:pPr>
-              <w:jc w:val="both"/>
-              <w:rPr>
-                <w:rFonts w:ascii="Calibri" w:hAnsi="Calibri" w:cs="Arial"/>
-                <w:i/>
-                <w:color w:val="548DD4"/>
-                <w:sz w:val="20"/>
-                <w:szCs w:val="20"/>
-                <w:lang w:eastAsia="es-CL"/>
-              </w:rPr>
-            </w:pPr>
-          </w:p>
-          <w:p>
-            <w:pPr>
-              <w:jc w:val="both"/>
-              <w:rPr>
-                <w:rFonts w:ascii="Calibri" w:hAnsi="Calibri" w:cs="Arial"/>
-                <w:i/>
-                <w:color w:val="548DD4"/>
-                <w:sz w:val="20"/>
-                <w:szCs w:val="20"/>
-                <w:lang w:eastAsia="es-CL"/>
-              </w:rPr>
-            </w:pPr>
+              <w:t>Hasta el momento las actividades que no se han iniciado de manera formal y documentada son las pruebas de seguridad y rendimiento, ya que a medida que se trabaja se hacen pruebas pequeñas, pero el objetivo es realizarlas terminando el proyecto de manera global y documentada. El resto de las actividades continúan según el cronograma.</w:t>
+            </w:r>
           </w:p>
         </w:tc>
       </w:tr>
@@ -22353,14 +22374,14 @@
   <w:footnote w:id="1">
     <w:p>
       <w:pPr>
-        <w:pStyle w:val="Textonotapie"/>
+        <w:pStyle w:val="FootnoteText"/>
         <w:rPr>
           <w:color w:val="595959" w:themeColor="text1" w:themeTint="A6"/>
         </w:rPr>
       </w:pPr>
       <w:r>
         <w:rPr>
-          <w:rStyle w:val="Refdenotaalpie"/>
+          <w:rStyle w:val="FootnoteReference"/>
           <w:color w:val="595959" w:themeColor="text1" w:themeTint="A6"/>
         </w:rPr>
         <w:footnoteRef/>
@@ -22630,7 +22651,7 @@
   </w:tbl>
   <w:p>
     <w:pPr>
-      <w:pStyle w:val="Encabezado"/>
+      <w:pStyle w:val="Header"/>
     </w:pPr>
   </w:p>
 </w:hdr>
@@ -22759,8 +22780,240 @@
       </w:rPr>
     </w:lvl>
   </w:abstractNum>
+  <w:abstractNum w:abstractNumId="1" w15:restartNumberingAfterBreak="0">
+    <w:nsid w:val="3763192D"/>
+    <w:multiLevelType w:val="hybridMultilevel"/>
+    <w:tmpl w:val="8F2AC006"/>
+    <w:lvl w:ilvl="0" w:tplc="56E02EAA">
+      <w:numFmt w:val="bullet"/>
+      <w:lvlText w:val="-"/>
+      <w:lvlJc w:val="left"/>
+      <w:pPr>
+        <w:ind w:left="720" w:hanging="360"/>
+      </w:pPr>
+      <w:rPr>
+        <w:rFonts w:ascii="Calibri" w:eastAsiaTheme="minorHAnsi" w:hAnsi="Calibri" w:cs="Calibri" w:hint="default"/>
+        <w:i w:val="0"/>
+      </w:rPr>
+    </w:lvl>
+    <w:lvl w:ilvl="1" w:tplc="340A0003" w:tentative="1">
+      <w:start w:val="1"/>
+      <w:numFmt w:val="bullet"/>
+      <w:lvlText w:val="o"/>
+      <w:lvlJc w:val="left"/>
+      <w:pPr>
+        <w:ind w:left="1440" w:hanging="360"/>
+      </w:pPr>
+      <w:rPr>
+        <w:rFonts w:ascii="Courier New" w:hAnsi="Courier New" w:cs="Courier New" w:hint="default"/>
+      </w:rPr>
+    </w:lvl>
+    <w:lvl w:ilvl="2" w:tplc="340A0005" w:tentative="1">
+      <w:start w:val="1"/>
+      <w:numFmt w:val="bullet"/>
+      <w:lvlText w:val=""/>
+      <w:lvlJc w:val="left"/>
+      <w:pPr>
+        <w:ind w:left="2160" w:hanging="360"/>
+      </w:pPr>
+      <w:rPr>
+        <w:rFonts w:ascii="Wingdings" w:hAnsi="Wingdings" w:hint="default"/>
+      </w:rPr>
+    </w:lvl>
+    <w:lvl w:ilvl="3" w:tplc="340A0001" w:tentative="1">
+      <w:start w:val="1"/>
+      <w:numFmt w:val="bullet"/>
+      <w:lvlText w:val=""/>
+      <w:lvlJc w:val="left"/>
+      <w:pPr>
+        <w:ind w:left="2880" w:hanging="360"/>
+      </w:pPr>
+      <w:rPr>
+        <w:rFonts w:ascii="Symbol" w:hAnsi="Symbol" w:hint="default"/>
+      </w:rPr>
+    </w:lvl>
+    <w:lvl w:ilvl="4" w:tplc="340A0003" w:tentative="1">
+      <w:start w:val="1"/>
+      <w:numFmt w:val="bullet"/>
+      <w:lvlText w:val="o"/>
+      <w:lvlJc w:val="left"/>
+      <w:pPr>
+        <w:ind w:left="3600" w:hanging="360"/>
+      </w:pPr>
+      <w:rPr>
+        <w:rFonts w:ascii="Courier New" w:hAnsi="Courier New" w:cs="Courier New" w:hint="default"/>
+      </w:rPr>
+    </w:lvl>
+    <w:lvl w:ilvl="5" w:tplc="340A0005" w:tentative="1">
+      <w:start w:val="1"/>
+      <w:numFmt w:val="bullet"/>
+      <w:lvlText w:val=""/>
+      <w:lvlJc w:val="left"/>
+      <w:pPr>
+        <w:ind w:left="4320" w:hanging="360"/>
+      </w:pPr>
+      <w:rPr>
+        <w:rFonts w:ascii="Wingdings" w:hAnsi="Wingdings" w:hint="default"/>
+      </w:rPr>
+    </w:lvl>
+    <w:lvl w:ilvl="6" w:tplc="340A0001" w:tentative="1">
+      <w:start w:val="1"/>
+      <w:numFmt w:val="bullet"/>
+      <w:lvlText w:val=""/>
+      <w:lvlJc w:val="left"/>
+      <w:pPr>
+        <w:ind w:left="5040" w:hanging="360"/>
+      </w:pPr>
+      <w:rPr>
+        <w:rFonts w:ascii="Symbol" w:hAnsi="Symbol" w:hint="default"/>
+      </w:rPr>
+    </w:lvl>
+    <w:lvl w:ilvl="7" w:tplc="340A0003" w:tentative="1">
+      <w:start w:val="1"/>
+      <w:numFmt w:val="bullet"/>
+      <w:lvlText w:val="o"/>
+      <w:lvlJc w:val="left"/>
+      <w:pPr>
+        <w:ind w:left="5760" w:hanging="360"/>
+      </w:pPr>
+      <w:rPr>
+        <w:rFonts w:ascii="Courier New" w:hAnsi="Courier New" w:cs="Courier New" w:hint="default"/>
+      </w:rPr>
+    </w:lvl>
+    <w:lvl w:ilvl="8" w:tplc="340A0005" w:tentative="1">
+      <w:start w:val="1"/>
+      <w:numFmt w:val="bullet"/>
+      <w:lvlText w:val=""/>
+      <w:lvlJc w:val="left"/>
+      <w:pPr>
+        <w:ind w:left="6480" w:hanging="360"/>
+      </w:pPr>
+      <w:rPr>
+        <w:rFonts w:ascii="Wingdings" w:hAnsi="Wingdings" w:hint="default"/>
+      </w:rPr>
+    </w:lvl>
+  </w:abstractNum>
+  <w:abstractNum w:abstractNumId="2" w15:restartNumberingAfterBreak="0">
+    <w:nsid w:val="5ACB645E"/>
+    <w:multiLevelType w:val="hybridMultilevel"/>
+    <w:tmpl w:val="86803E48"/>
+    <w:lvl w:ilvl="0" w:tplc="340A0001">
+      <w:start w:val="1"/>
+      <w:numFmt w:val="bullet"/>
+      <w:lvlText w:val=""/>
+      <w:lvlJc w:val="left"/>
+      <w:pPr>
+        <w:ind w:left="720" w:hanging="360"/>
+      </w:pPr>
+      <w:rPr>
+        <w:rFonts w:ascii="Symbol" w:hAnsi="Symbol" w:hint="default"/>
+      </w:rPr>
+    </w:lvl>
+    <w:lvl w:ilvl="1" w:tplc="340A0003" w:tentative="1">
+      <w:start w:val="1"/>
+      <w:numFmt w:val="bullet"/>
+      <w:lvlText w:val="o"/>
+      <w:lvlJc w:val="left"/>
+      <w:pPr>
+        <w:ind w:left="1440" w:hanging="360"/>
+      </w:pPr>
+      <w:rPr>
+        <w:rFonts w:ascii="Courier New" w:hAnsi="Courier New" w:cs="Courier New" w:hint="default"/>
+      </w:rPr>
+    </w:lvl>
+    <w:lvl w:ilvl="2" w:tplc="340A0005" w:tentative="1">
+      <w:start w:val="1"/>
+      <w:numFmt w:val="bullet"/>
+      <w:lvlText w:val=""/>
+      <w:lvlJc w:val="left"/>
+      <w:pPr>
+        <w:ind w:left="2160" w:hanging="360"/>
+      </w:pPr>
+      <w:rPr>
+        <w:rFonts w:ascii="Wingdings" w:hAnsi="Wingdings" w:hint="default"/>
+      </w:rPr>
+    </w:lvl>
+    <w:lvl w:ilvl="3" w:tplc="340A0001" w:tentative="1">
+      <w:start w:val="1"/>
+      <w:numFmt w:val="bullet"/>
+      <w:lvlText w:val=""/>
+      <w:lvlJc w:val="left"/>
+      <w:pPr>
+        <w:ind w:left="2880" w:hanging="360"/>
+      </w:pPr>
+      <w:rPr>
+        <w:rFonts w:ascii="Symbol" w:hAnsi="Symbol" w:hint="default"/>
+      </w:rPr>
+    </w:lvl>
+    <w:lvl w:ilvl="4" w:tplc="340A0003" w:tentative="1">
+      <w:start w:val="1"/>
+      <w:numFmt w:val="bullet"/>
+      <w:lvlText w:val="o"/>
+      <w:lvlJc w:val="left"/>
+      <w:pPr>
+        <w:ind w:left="3600" w:hanging="360"/>
+      </w:pPr>
+      <w:rPr>
+        <w:rFonts w:ascii="Courier New" w:hAnsi="Courier New" w:cs="Courier New" w:hint="default"/>
+      </w:rPr>
+    </w:lvl>
+    <w:lvl w:ilvl="5" w:tplc="340A0005" w:tentative="1">
+      <w:start w:val="1"/>
+      <w:numFmt w:val="bullet"/>
+      <w:lvlText w:val=""/>
+      <w:lvlJc w:val="left"/>
+      <w:pPr>
+        <w:ind w:left="4320" w:hanging="360"/>
+      </w:pPr>
+      <w:rPr>
+        <w:rFonts w:ascii="Wingdings" w:hAnsi="Wingdings" w:hint="default"/>
+      </w:rPr>
+    </w:lvl>
+    <w:lvl w:ilvl="6" w:tplc="340A0001" w:tentative="1">
+      <w:start w:val="1"/>
+      <w:numFmt w:val="bullet"/>
+      <w:lvlText w:val=""/>
+      <w:lvlJc w:val="left"/>
+      <w:pPr>
+        <w:ind w:left="5040" w:hanging="360"/>
+      </w:pPr>
+      <w:rPr>
+        <w:rFonts w:ascii="Symbol" w:hAnsi="Symbol" w:hint="default"/>
+      </w:rPr>
+    </w:lvl>
+    <w:lvl w:ilvl="7" w:tplc="340A0003" w:tentative="1">
+      <w:start w:val="1"/>
+      <w:numFmt w:val="bullet"/>
+      <w:lvlText w:val="o"/>
+      <w:lvlJc w:val="left"/>
+      <w:pPr>
+        <w:ind w:left="5760" w:hanging="360"/>
+      </w:pPr>
+      <w:rPr>
+        <w:rFonts w:ascii="Courier New" w:hAnsi="Courier New" w:cs="Courier New" w:hint="default"/>
+      </w:rPr>
+    </w:lvl>
+    <w:lvl w:ilvl="8" w:tplc="340A0005" w:tentative="1">
+      <w:start w:val="1"/>
+      <w:numFmt w:val="bullet"/>
+      <w:lvlText w:val=""/>
+      <w:lvlJc w:val="left"/>
+      <w:pPr>
+        <w:ind w:left="6480" w:hanging="360"/>
+      </w:pPr>
+      <w:rPr>
+        <w:rFonts w:ascii="Wingdings" w:hAnsi="Wingdings" w:hint="default"/>
+      </w:rPr>
+    </w:lvl>
+  </w:abstractNum>
   <w:num w:numId="1" w16cid:durableId="455098783">
     <w:abstractNumId w:val="0"/>
+  </w:num>
+  <w:num w:numId="2" w16cid:durableId="1110734057">
+    <w:abstractNumId w:val="2"/>
+  </w:num>
+  <w:num w:numId="3" w16cid:durableId="674000176">
+    <w:abstractNumId w:val="1"/>
   </w:num>
 </w:numbering>
 </file>
@@ -23168,11 +23421,11 @@
       <w:szCs w:val="22"/>
     </w:rPr>
   </w:style>
-  <w:style w:type="paragraph" w:styleId="Ttulo3">
+  <w:style w:type="paragraph" w:styleId="Heading3">
     <w:name w:val="heading 3"/>
     <w:basedOn w:val="Normal"/>
     <w:next w:val="Normal"/>
-    <w:link w:val="Ttulo3Car"/>
+    <w:link w:val="Heading3Char"/>
     <w:uiPriority w:val="9"/>
     <w:unhideWhenUsed/>
     <w:qFormat/>
@@ -23190,12 +23443,12 @@
       <w:szCs w:val="24"/>
     </w:rPr>
   </w:style>
-  <w:style w:type="character" w:default="1" w:styleId="Fuentedeprrafopredeter">
+  <w:style w:type="character" w:default="1" w:styleId="DefaultParagraphFont">
     <w:name w:val="Default Paragraph Font"/>
     <w:uiPriority w:val="1"/>
     <w:unhideWhenUsed/>
   </w:style>
-  <w:style w:type="table" w:default="1" w:styleId="Tablanormal">
+  <w:style w:type="table" w:default="1" w:styleId="TableNormal">
     <w:name w:val="Normal Table"/>
     <w:uiPriority w:val="99"/>
     <w:semiHidden/>
@@ -23210,16 +23463,16 @@
       </w:tblCellMar>
     </w:tblPr>
   </w:style>
-  <w:style w:type="numbering" w:default="1" w:styleId="Sinlista">
+  <w:style w:type="numbering" w:default="1" w:styleId="NoList">
     <w:name w:val="No List"/>
     <w:uiPriority w:val="99"/>
     <w:semiHidden/>
     <w:unhideWhenUsed/>
   </w:style>
-  <w:style w:type="character" w:customStyle="1" w:styleId="Ttulo3Car">
-    <w:name w:val="Título 3 Car"/>
-    <w:basedOn w:val="Fuentedeprrafopredeter"/>
-    <w:link w:val="Ttulo3"/>
+  <w:style w:type="character" w:customStyle="1" w:styleId="Heading3Char">
+    <w:name w:val="Heading 3 Char"/>
+    <w:basedOn w:val="DefaultParagraphFont"/>
+    <w:link w:val="Heading3"/>
     <w:uiPriority w:val="9"/>
     <w:rsid w:val="0003309E"/>
     <w:rPr>
@@ -23227,9 +23480,9 @@
       <w:color w:val="1F3763" w:themeColor="accent1" w:themeShade="7F"/>
     </w:rPr>
   </w:style>
-  <w:style w:type="table" w:styleId="Tablaconcuadrcula">
+  <w:style w:type="table" w:styleId="TableGrid">
     <w:name w:val="Table Grid"/>
-    <w:basedOn w:val="Tablanormal"/>
+    <w:basedOn w:val="TableNormal"/>
     <w:uiPriority w:val="39"/>
     <w:rsid w:val="0003309E"/>
     <w:rPr>
@@ -23247,10 +23500,10 @@
       </w:tblBorders>
     </w:tblPr>
   </w:style>
-  <w:style w:type="paragraph" w:styleId="Piedepgina">
+  <w:style w:type="paragraph" w:styleId="Footer">
     <w:name w:val="footer"/>
     <w:basedOn w:val="Normal"/>
-    <w:link w:val="PiedepginaCar"/>
+    <w:link w:val="FooterChar"/>
     <w:uiPriority w:val="99"/>
     <w:unhideWhenUsed/>
     <w:rsid w:val="0003309E"/>
@@ -23262,10 +23515,10 @@
       <w:spacing w:after="0" w:line="240" w:lineRule="auto"/>
     </w:pPr>
   </w:style>
-  <w:style w:type="character" w:customStyle="1" w:styleId="PiedepginaCar">
-    <w:name w:val="Pie de página Car"/>
-    <w:basedOn w:val="Fuentedeprrafopredeter"/>
-    <w:link w:val="Piedepgina"/>
+  <w:style w:type="character" w:customStyle="1" w:styleId="FooterChar">
+    <w:name w:val="Footer Char"/>
+    <w:basedOn w:val="DefaultParagraphFont"/>
+    <w:link w:val="Footer"/>
     <w:uiPriority w:val="99"/>
     <w:rsid w:val="0003309E"/>
     <w:rPr>
@@ -23273,10 +23526,10 @@
       <w:szCs w:val="22"/>
     </w:rPr>
   </w:style>
-  <w:style w:type="paragraph" w:styleId="Textonotapie">
+  <w:style w:type="paragraph" w:styleId="FootnoteText">
     <w:name w:val="footnote text"/>
     <w:basedOn w:val="Normal"/>
-    <w:link w:val="TextonotapieCar"/>
+    <w:link w:val="FootnoteTextChar"/>
     <w:uiPriority w:val="99"/>
     <w:semiHidden/>
     <w:unhideWhenUsed/>
@@ -23290,10 +23543,10 @@
       <w:lang w:val="es-ES"/>
     </w:rPr>
   </w:style>
-  <w:style w:type="character" w:customStyle="1" w:styleId="TextonotapieCar">
-    <w:name w:val="Texto nota pie Car"/>
-    <w:basedOn w:val="Fuentedeprrafopredeter"/>
-    <w:link w:val="Textonotapie"/>
+  <w:style w:type="character" w:customStyle="1" w:styleId="FootnoteTextChar">
+    <w:name w:val="Footnote Text Char"/>
+    <w:basedOn w:val="DefaultParagraphFont"/>
+    <w:link w:val="FootnoteText"/>
     <w:uiPriority w:val="99"/>
     <w:semiHidden/>
     <w:rsid w:val="0003309E"/>
@@ -23303,19 +23556,19 @@
       <w:lang w:val="es-ES"/>
     </w:rPr>
   </w:style>
-  <w:style w:type="character" w:styleId="Refdenotaalpie">
+  <w:style w:type="character" w:styleId="FootnoteReference">
     <w:name w:val="footnote reference"/>
-    <w:basedOn w:val="Fuentedeprrafopredeter"/>
+    <w:basedOn w:val="DefaultParagraphFont"/>
     <w:unhideWhenUsed/>
     <w:rsid w:val="0003309E"/>
     <w:rPr>
       <w:vertAlign w:val="superscript"/>
     </w:rPr>
   </w:style>
-  <w:style w:type="paragraph" w:styleId="Encabezado">
+  <w:style w:type="paragraph" w:styleId="Header">
     <w:name w:val="header"/>
     <w:basedOn w:val="Normal"/>
-    <w:link w:val="EncabezadoCar"/>
+    <w:link w:val="HeaderChar"/>
     <w:uiPriority w:val="99"/>
     <w:unhideWhenUsed/>
     <w:rsid w:val="00586C9C"/>
@@ -23327,10 +23580,10 @@
       <w:spacing w:after="0" w:line="240" w:lineRule="auto"/>
     </w:pPr>
   </w:style>
-  <w:style w:type="character" w:customStyle="1" w:styleId="EncabezadoCar">
-    <w:name w:val="Encabezado Car"/>
-    <w:basedOn w:val="Fuentedeprrafopredeter"/>
-    <w:link w:val="Encabezado"/>
+  <w:style w:type="character" w:customStyle="1" w:styleId="HeaderChar">
+    <w:name w:val="Header Char"/>
+    <w:basedOn w:val="DefaultParagraphFont"/>
+    <w:link w:val="Header"/>
     <w:uiPriority w:val="99"/>
     <w:rsid w:val="00586C9C"/>
     <w:rPr>
@@ -23340,8 +23593,8 @@
   </w:style>
   <w:style w:type="table" w:customStyle="1" w:styleId="Tablaconcuadrcula1">
     <w:name w:val="Tabla con cuadrícula1"/>
-    <w:basedOn w:val="Tablanormal"/>
-    <w:next w:val="Tablaconcuadrcula"/>
+    <w:basedOn w:val="TableNormal"/>
+    <w:next w:val="TableGrid"/>
     <w:uiPriority w:val="39"/>
     <w:rsid w:val="00C44557"/>
     <w:rPr>
@@ -23359,10 +23612,10 @@
       </w:tblBorders>
     </w:tblPr>
   </w:style>
-  <w:style w:type="paragraph" w:styleId="Textodeglobo">
+  <w:style w:type="paragraph" w:styleId="BalloonText">
     <w:name w:val="Balloon Text"/>
     <w:basedOn w:val="Normal"/>
-    <w:link w:val="TextodegloboCar"/>
+    <w:link w:val="BalloonTextChar"/>
     <w:uiPriority w:val="99"/>
     <w:semiHidden/>
     <w:unhideWhenUsed/>
@@ -23376,10 +23629,10 @@
       <w:szCs w:val="18"/>
     </w:rPr>
   </w:style>
-  <w:style w:type="character" w:customStyle="1" w:styleId="TextodegloboCar">
-    <w:name w:val="Texto de globo Car"/>
-    <w:basedOn w:val="Fuentedeprrafopredeter"/>
-    <w:link w:val="Textodeglobo"/>
+  <w:style w:type="character" w:customStyle="1" w:styleId="BalloonTextChar">
+    <w:name w:val="Balloon Text Char"/>
+    <w:basedOn w:val="DefaultParagraphFont"/>
+    <w:link w:val="BalloonText"/>
     <w:uiPriority w:val="99"/>
     <w:semiHidden/>
     <w:rsid w:val="00C5122E"/>
@@ -23389,9 +23642,9 @@
       <w:szCs w:val="18"/>
     </w:rPr>
   </w:style>
-  <w:style w:type="character" w:styleId="Refdecomentario">
+  <w:style w:type="character" w:styleId="CommentReference">
     <w:name w:val="annotation reference"/>
-    <w:basedOn w:val="Fuentedeprrafopredeter"/>
+    <w:basedOn w:val="DefaultParagraphFont"/>
     <w:uiPriority w:val="99"/>
     <w:semiHidden/>
     <w:unhideWhenUsed/>
@@ -23401,10 +23654,10 @@
       <w:szCs w:val="16"/>
     </w:rPr>
   </w:style>
-  <w:style w:type="paragraph" w:styleId="Textocomentario">
+  <w:style w:type="paragraph" w:styleId="CommentText">
     <w:name w:val="annotation text"/>
     <w:basedOn w:val="Normal"/>
-    <w:link w:val="TextocomentarioCar"/>
+    <w:link w:val="CommentTextChar"/>
     <w:uiPriority w:val="99"/>
     <w:semiHidden/>
     <w:unhideWhenUsed/>
@@ -23417,10 +23670,10 @@
       <w:szCs w:val="20"/>
     </w:rPr>
   </w:style>
-  <w:style w:type="character" w:customStyle="1" w:styleId="TextocomentarioCar">
-    <w:name w:val="Texto comentario Car"/>
-    <w:basedOn w:val="Fuentedeprrafopredeter"/>
-    <w:link w:val="Textocomentario"/>
+  <w:style w:type="character" w:customStyle="1" w:styleId="CommentTextChar">
+    <w:name w:val="Comment Text Char"/>
+    <w:basedOn w:val="DefaultParagraphFont"/>
+    <w:link w:val="CommentText"/>
     <w:uiPriority w:val="99"/>
     <w:semiHidden/>
     <w:rsid w:val="009E52DF"/>
@@ -23429,11 +23682,11 @@
       <w:szCs w:val="20"/>
     </w:rPr>
   </w:style>
-  <w:style w:type="paragraph" w:styleId="Asuntodelcomentario">
+  <w:style w:type="paragraph" w:styleId="CommentSubject">
     <w:name w:val="annotation subject"/>
-    <w:basedOn w:val="Textocomentario"/>
-    <w:next w:val="Textocomentario"/>
-    <w:link w:val="AsuntodelcomentarioCar"/>
+    <w:basedOn w:val="CommentText"/>
+    <w:next w:val="CommentText"/>
+    <w:link w:val="CommentSubjectChar"/>
     <w:uiPriority w:val="99"/>
     <w:semiHidden/>
     <w:unhideWhenUsed/>
@@ -23443,10 +23696,10 @@
       <w:bCs/>
     </w:rPr>
   </w:style>
-  <w:style w:type="character" w:customStyle="1" w:styleId="AsuntodelcomentarioCar">
-    <w:name w:val="Asunto del comentario Car"/>
-    <w:basedOn w:val="TextocomentarioCar"/>
-    <w:link w:val="Asuntodelcomentario"/>
+  <w:style w:type="character" w:customStyle="1" w:styleId="CommentSubjectChar">
+    <w:name w:val="Comment Subject Char"/>
+    <w:basedOn w:val="CommentTextChar"/>
+    <w:link w:val="CommentSubject"/>
     <w:uiPriority w:val="99"/>
     <w:semiHidden/>
     <w:rsid w:val="009E52DF"/>
@@ -23469,6 +23722,17 @@
       <w:sz w:val="24"/>
       <w:szCs w:val="24"/>
     </w:rPr>
+  </w:style>
+  <w:style w:type="paragraph" w:styleId="ListParagraph">
+    <w:name w:val="List Paragraph"/>
+    <w:basedOn w:val="Normal"/>
+    <w:uiPriority w:val="34"/>
+    <w:qFormat/>
+    <w:rsid w:val="00D27396"/>
+    <w:pPr>
+      <w:ind w:left="720"/>
+      <w:contextualSpacing/>
+    </w:pPr>
   </w:style>
 </w:styles>
 </file>

</xml_diff>